<commit_message>
Remove dashes and quoted phrases from the first member's report
Rewrites the sentences that used a dash as an aside so they read as
ordinary prose, and drops the quotation marks that were wrapped around
phrases. The GoF definition is now paraphrased with its citation rather
than quoted inline.

Co-Authored-By: Claude Opus 5 <noreply@anthropic.com>
</commit_message>
<xml_diff>
--- a/Report/Member1_SerenaLimSzeKee_Module1.docx
+++ b/Report/Member1_SerenaLimSzeKee_Module1.docx
@@ -158,7 +158,7 @@
           <w:b w:val="0"/>
           <w:i w:val="0"/>
         </w:rPr>
-        <w:t xml:space="preserve"> : Module 1 — Identity, Access &amp; Digital Credentialing Module</w:t>
+        <w:t xml:space="preserve"> : Module 1: Identity, Access and Digital Credentialing Module</w:t>
       </w:r>
     </w:p>
     <w:p/>
@@ -475,49 +475,7 @@
           <w:b w:val="0"/>
           <w:i w:val="0"/>
         </w:rPr>
-        <w:t xml:space="preserve"> This assignment is YELLOW (Limited AI). The policy does not allow AI to write </w:t>
-      </w:r>
-      <w:r>
-        <w:rPr>
-          <w:b w:val="0"/>
-          <w:i/>
-        </w:rPr>
-        <w:t>"the design-pattern justification, threat analysis, and secure-coding rationale"</w:t>
-      </w:r>
-      <w:r>
-        <w:rPr>
-          <w:b w:val="0"/>
-          <w:i w:val="0"/>
-        </w:rPr>
-        <w:t xml:space="preserve">. That means sections </w:t>
-      </w:r>
-      <w:r>
-        <w:rPr>
-          <w:b/>
-          <w:i w:val="0"/>
-        </w:rPr>
-        <w:t>4.3, 5.1 and 5.2</w:t>
-      </w:r>
-      <w:r>
-        <w:rPr>
-          <w:b w:val="0"/>
-          <w:i w:val="0"/>
-        </w:rPr>
-        <w:t xml:space="preserve">. You should </w:t>
-      </w:r>
-      <w:r>
-        <w:rPr>
-          <w:b/>
-          <w:i w:val="0"/>
-        </w:rPr>
-        <w:t>rewrite those three sections in your own words</w:t>
-      </w:r>
-      <w:r>
-        <w:rPr>
-          <w:b w:val="0"/>
-          <w:i w:val="0"/>
-        </w:rPr>
-        <w:t>. Everything in them is true about your code, so you only need to say the same things your own way. In the sample report you shared, the student declared only Grammarly for grammar checking.</w:t>
+        <w:t xml:space="preserve"> This assignment is YELLOW (Limited AI). The policy does not allow AI to write the design pattern justification, the threat analysis or the secure coding rationale. Those are sections 4.3, 5.1 and 5.2. You should rewrite those three sections in your own words. Everything in them is true about your code, so you only need to say the same things your own way. In the sample report you shared, the student declared only Grammarly for grammar checking.</w:t>
       </w:r>
     </w:p>
     <w:p/>
@@ -1369,21 +1327,7 @@
           <w:b w:val="0"/>
           <w:i w:val="0"/>
         </w:rPr>
-        <w:t xml:space="preserve"> These page numbers are only estimates. In Word, delete this table and use </w:t>
-      </w:r>
-      <w:r>
-        <w:rPr>
-          <w:b/>
-          <w:i w:val="0"/>
-        </w:rPr>
-        <w:t>References &gt; Table of Contents &gt; Automatic Table</w:t>
-      </w:r>
-      <w:r>
-        <w:rPr>
-          <w:b w:val="0"/>
-          <w:i w:val="0"/>
-        </w:rPr>
-        <w:t>. Word will read the headings and fill in the correct page numbers by itself.</w:t>
+        <w:t xml:space="preserve"> These page numbers are only estimates. In Word, delete this table and use References then Table of Contents then Automatic Table. Word will read the headings and fill in the correct page numbers by itself.</w:t>
       </w:r>
     </w:p>
     <w:p/>
@@ -1416,17 +1360,10 @@
     <w:p>
       <w:r>
         <w:rPr>
-          <w:b/>
-          <w:i w:val="0"/>
-        </w:rPr>
-        <w:t>LearnSync</w:t>
-      </w:r>
-      <w:r>
-        <w:rPr>
-          <w:b w:val="0"/>
-          <w:i w:val="0"/>
-        </w:rPr>
-        <w:t xml:space="preserve"> is a web-based Learning Management System (LMS). Lecturers use it to upload notes, set quizzes, give assignments and mark student work. Students use it to study the notes, sit the quizzes, hand in assignments, watch their progress, and ask questions in a course forum.</w:t>
+          <w:b w:val="0"/>
+          <w:i w:val="0"/>
+        </w:rPr>
+        <w:t>LearnSync is a web based Learning Management System (LMS). Lecturers use it to upload notes, set quizzes, give assignments and mark student work. Students use it to study the notes, sit the quizzes, hand in assignments, watch their progress, and ask questions in a course forum.</w:t>
       </w:r>
     </w:p>
     <w:p>
@@ -1435,21 +1372,7 @@
           <w:b w:val="0"/>
           <w:i w:val="0"/>
         </w:rPr>
-        <w:t xml:space="preserve">The problem LearnSync solves is about </w:t>
-      </w:r>
-      <w:r>
-        <w:rPr>
-          <w:b/>
-          <w:i w:val="0"/>
-        </w:rPr>
-        <w:t>proof</w:t>
-      </w:r>
-      <w:r>
-        <w:rPr>
-          <w:b w:val="0"/>
-          <w:i w:val="0"/>
-        </w:rPr>
-        <w:t>. In most systems, the certificate a student earns is just a PDF file. Anyone can open that PDF in a word processor and change the marks. If an employer wants to check whether a certificate is real, they must email the college and wait days for a reply. Most employers do not bother.</w:t>
+        <w:t>The problem LearnSync solves is about proof. In most systems, the certificate a student earns is just a PDF file. Anyone can open that PDF in a word processor and change the marks. If an employer wants to check whether a certificate is real, they must email the college and wait days for a reply. Most employers do not bother.</w:t>
       </w:r>
     </w:p>
     <w:p>
@@ -1458,33 +1381,19 @@
           <w:b w:val="0"/>
           <w:i w:val="0"/>
         </w:rPr>
-        <w:t>LearnSync fixes this. Every certificate it creates has:</w:t>
+        <w:t>LearnSync fixes this. Every certificate it creates has three things:</w:t>
       </w:r>
     </w:p>
     <w:p>
       <w:pPr>
-        <w:pStyle w:val="ListBullet"/>
+        <w:pStyle w:val="ListNumber"/>
       </w:pPr>
       <w:r>
         <w:rPr>
           <w:b w:val="0"/>
           <w:i w:val="0"/>
         </w:rPr>
-        <w:t xml:space="preserve">a </w:t>
-      </w:r>
-      <w:r>
-        <w:rPr>
-          <w:b/>
-          <w:i w:val="0"/>
-        </w:rPr>
-        <w:t>unique ID</w:t>
-      </w:r>
-      <w:r>
-        <w:rPr>
-          <w:b w:val="0"/>
-          <w:i w:val="0"/>
-        </w:rPr>
-        <w:t xml:space="preserve"> printed on it, such as </w:t>
+        <w:t xml:space="preserve">A unique ID printed on it, such as </w:t>
       </w:r>
       <w:r>
         <w:rPr>
@@ -1501,59 +1410,31 @@
           <w:b w:val="0"/>
           <w:i w:val="0"/>
         </w:rPr>
-        <w:t>;</w:t>
+        <w:t>.</w:t>
       </w:r>
     </w:p>
     <w:p>
       <w:pPr>
-        <w:pStyle w:val="ListBullet"/>
+        <w:pStyle w:val="ListNumber"/>
       </w:pPr>
       <w:r>
         <w:rPr>
           <w:b w:val="0"/>
           <w:i w:val="0"/>
         </w:rPr>
-        <w:t xml:space="preserve">a </w:t>
-      </w:r>
-      <w:r>
-        <w:rPr>
-          <w:b/>
-          <w:i w:val="0"/>
-        </w:rPr>
-        <w:t>QR code</w:t>
-      </w:r>
-      <w:r>
-        <w:rPr>
-          <w:b w:val="0"/>
-          <w:i w:val="0"/>
-        </w:rPr>
-        <w:t xml:space="preserve"> that anyone can scan with a phone;</w:t>
+        <w:t>A QR code that anyone can scan with a phone.</w:t>
       </w:r>
     </w:p>
     <w:p>
       <w:pPr>
-        <w:pStyle w:val="ListBullet"/>
+        <w:pStyle w:val="ListNumber"/>
       </w:pPr>
       <w:r>
         <w:rPr>
           <w:b w:val="0"/>
           <w:i w:val="0"/>
         </w:rPr>
-        <w:t xml:space="preserve">a hidden </w:t>
-      </w:r>
-      <w:r>
-        <w:rPr>
-          <w:b/>
-          <w:i w:val="0"/>
-        </w:rPr>
-        <w:t>security code (a hash)</w:t>
-      </w:r>
-      <w:r>
-        <w:rPr>
-          <w:b w:val="0"/>
-          <w:i w:val="0"/>
-        </w:rPr>
-        <w:t xml:space="preserve"> that proves nobody has changed the record.</w:t>
+        <w:t>A hidden security code, called a hash, which proves that nobody has changed the record.</w:t>
       </w:r>
     </w:p>
     <w:p>
@@ -1584,21 +1465,7 @@
           <w:b w:val="0"/>
           <w:i w:val="0"/>
         </w:rPr>
-        <w:t xml:space="preserve">LearnSync is built around </w:t>
-      </w:r>
-      <w:r>
-        <w:rPr>
-          <w:b/>
-          <w:i w:val="0"/>
-        </w:rPr>
-        <w:t>United Nations Sustainable Development Goal 4: Quality Education (SDG 4)</w:t>
-      </w:r>
-      <w:r>
-        <w:rPr>
-          <w:b w:val="0"/>
-          <w:i w:val="0"/>
-        </w:rPr>
-        <w:t>.</w:t>
+        <w:t>LearnSync is built around United Nations Sustainable Development Goal 4: Quality Education (SDG 4).</w:t>
       </w:r>
     </w:p>
     <w:p>
@@ -1616,35 +1483,7 @@
           <w:b w:val="0"/>
           <w:i w:val="0"/>
         </w:rPr>
-        <w:t xml:space="preserve">SDG 4 wants to make sure education is fair, good quality and available to everyone by 2030 (United Nations, 2015). Two of its targets matter here. </w:t>
-      </w:r>
-      <w:r>
-        <w:rPr>
-          <w:b/>
-          <w:i w:val="0"/>
-        </w:rPr>
-        <w:t>Target 4.3</w:t>
-      </w:r>
-      <w:r>
-        <w:rPr>
-          <w:b w:val="0"/>
-          <w:i w:val="0"/>
-        </w:rPr>
-        <w:t xml:space="preserve"> is about giving everyone fair access to affordable college and university education. </w:t>
-      </w:r>
-      <w:r>
-        <w:rPr>
-          <w:b/>
-          <w:i w:val="0"/>
-        </w:rPr>
-        <w:t>Target 4.4</w:t>
-      </w:r>
-      <w:r>
-        <w:rPr>
-          <w:b w:val="0"/>
-          <w:i w:val="0"/>
-        </w:rPr>
-        <w:t xml:space="preserve"> is about increasing the number of people who have real skills for getting a job.</w:t>
+        <w:t>SDG 4 wants to make sure education is fair, good quality and available to everyone by 2030 (United Nations, 2015). Two of its targets matter here. Target 4.3 is about giving everyone fair access to affordable college and university education. Target 4.4 is about increasing the number of people who have real skills for getting a job.</w:t>
       </w:r>
     </w:p>
     <w:p>
@@ -1685,21 +1524,7 @@
           <w:b w:val="0"/>
           <w:i w:val="0"/>
         </w:rPr>
-        <w:t xml:space="preserve"> Students who earn certificates, lecturers who teach and mark the courses, administrators who control who can do what, and — most importantly — </w:t>
-      </w:r>
-      <w:r>
-        <w:rPr>
-          <w:b/>
-          <w:i w:val="0"/>
-        </w:rPr>
-        <w:t>outside people such as employers</w:t>
-      </w:r>
-      <w:r>
-        <w:rPr>
-          <w:b w:val="0"/>
-          <w:i w:val="0"/>
-        </w:rPr>
-        <w:t>, who can check a certificate without having an account.</w:t>
+        <w:t xml:space="preserve"> Students who earn certificates, lecturers who teach and mark the courses, administrators who control who can do what, and outside people such as employers. The employers matter most here, because they can check a certificate without having an account.</w:t>
       </w:r>
     </w:p>
     <w:p>
@@ -1737,35 +1562,7 @@
           <w:b w:val="0"/>
           <w:i w:val="0"/>
         </w:rPr>
-        <w:t xml:space="preserve"> Each certificate stores a security code called a </w:t>
-      </w:r>
-      <w:r>
-        <w:rPr>
-          <w:b/>
-          <w:i w:val="0"/>
-        </w:rPr>
-        <w:t>SHA-256 hash</w:t>
-      </w:r>
-      <w:r>
-        <w:rPr>
-          <w:b w:val="0"/>
-          <w:i w:val="0"/>
-        </w:rPr>
-        <w:t xml:space="preserve">. The system works this code out again every time someone checks the certificate. If anyone changes the record — even by editing the database directly — the two codes will not match, and the page shows </w:t>
-      </w:r>
-      <w:r>
-        <w:rPr>
-          <w:b/>
-          <w:i w:val="0"/>
-        </w:rPr>
-        <w:t>TAMPERED</w:t>
-      </w:r>
-      <w:r>
-        <w:rPr>
-          <w:b w:val="0"/>
-          <w:i w:val="0"/>
-        </w:rPr>
-        <w:t xml:space="preserve"> instead of valid. So trust is not just assumed; it can be proven.</w:t>
+        <w:t xml:space="preserve"> Each certificate stores a security code called a SHA-256 hash. The system works this code out again every time someone checks the certificate. If anyone changes the record, even by editing the database directly, the two codes will not match, and the page shows TAMPERED instead of valid. So trust is not just assumed. It can be proven.</w:t>
       </w:r>
     </w:p>
     <w:p>
@@ -1817,21 +1614,7 @@
           <w:b w:val="0"/>
           <w:i w:val="0"/>
         </w:rPr>
-        <w:t xml:space="preserve">I am the developer in charge of </w:t>
-      </w:r>
-      <w:r>
-        <w:rPr>
-          <w:b/>
-          <w:i w:val="0"/>
-        </w:rPr>
-        <w:t>Module 1 (Identity, Access &amp; Digital Credentialing Module)</w:t>
-      </w:r>
-      <w:r>
-        <w:rPr>
-          <w:b w:val="0"/>
-          <w:i w:val="0"/>
-        </w:rPr>
-        <w:t>. I designed and built the following parts of LearnSync:</w:t>
+        <w:t>I am the developer in charge of Module 1, the Identity, Access and Digital Credentialing Module. I designed and built the following parts of LearnSync:</w:t>
       </w:r>
     </w:p>
     <w:p>
@@ -1843,7 +1626,7 @@
           <w:b w:val="0"/>
           <w:i w:val="0"/>
         </w:rPr>
-        <w:t>creating user accounts by invitation only;</w:t>
+        <w:t>creating user accounts by invitation only</w:t>
       </w:r>
     </w:p>
     <w:p>
@@ -1855,7 +1638,7 @@
           <w:b w:val="0"/>
           <w:i w:val="0"/>
         </w:rPr>
-        <w:t>a permission system stored in the database, so an admin can change who is allowed to do what without changing any code;</w:t>
+        <w:t>a permission system stored in the database, so an admin can change who is allowed to do what without changing any code</w:t>
       </w:r>
     </w:p>
     <w:p>
@@ -1867,7 +1650,7 @@
           <w:b w:val="0"/>
           <w:i w:val="0"/>
         </w:rPr>
-        <w:t>account controls such as locking, unlocking and forcing password changes;</w:t>
+        <w:t>account controls such as locking, unlocking and forcing password changes</w:t>
       </w:r>
     </w:p>
     <w:p>
@@ -1879,7 +1662,7 @@
           <w:b w:val="0"/>
           <w:i w:val="0"/>
         </w:rPr>
-        <w:t>a security log that records every important action;</w:t>
+        <w:t>a security log that records every important action</w:t>
       </w:r>
     </w:p>
     <w:p>
@@ -1891,7 +1674,7 @@
           <w:b w:val="0"/>
           <w:i w:val="0"/>
         </w:rPr>
-        <w:t>working out each student's progress in each course and saving a history of it;</w:t>
+        <w:t>working out each student's progress in each course and saving a history of it</w:t>
       </w:r>
     </w:p>
     <w:p>
@@ -1903,7 +1686,7 @@
           <w:b w:val="0"/>
           <w:i w:val="0"/>
         </w:rPr>
-        <w:t>creating certificates, protecting them with a security code, and letting anyone check them in public;</w:t>
+        <w:t>creating certificates, protecting them with a security code, and letting anyone check them in public</w:t>
       </w:r>
     </w:p>
     <w:p>
@@ -1915,7 +1698,7 @@
           <w:b w:val="0"/>
           <w:i w:val="0"/>
         </w:rPr>
-        <w:t>an award rules engine that an admin can configure;</w:t>
+        <w:t>an award rules engine that an admin can configure</w:t>
       </w:r>
     </w:p>
     <w:p>
@@ -1927,7 +1710,7 @@
           <w:b w:val="0"/>
           <w:i w:val="0"/>
         </w:rPr>
-        <w:t>the notification inbox and each user's notification settings.</w:t>
+        <w:t>the notification inbox and each user's notification settings</w:t>
       </w:r>
     </w:p>
     <w:p>
@@ -1989,7 +1772,7 @@
           <w:b w:val="0"/>
           <w:i w:val="0"/>
         </w:rPr>
-        <w:t xml:space="preserve"> gives a "404 Not Found" page. An account only exists after an admin sends an </w:t>
+        <w:t xml:space="preserve"> gives a 404 Not Found page. An account only exists after an admin sends an </w:t>
       </w:r>
       <w:r>
         <w:rPr>
@@ -2006,21 +1789,7 @@
           <w:b w:val="0"/>
           <w:i w:val="0"/>
         </w:rPr>
-        <w:t xml:space="preserve">. The invitation holds the person's email, the role they will get, a secret token, and a date when it expires. The system rejects a token if it is unknown, already used, expired, or if the email already has an account. The role comes </w:t>
-      </w:r>
-      <w:r>
-        <w:rPr>
-          <w:b/>
-          <w:i w:val="0"/>
-        </w:rPr>
-        <w:t>from the invitation, not from the sign-up form</w:t>
-      </w:r>
-      <w:r>
-        <w:rPr>
-          <w:b w:val="0"/>
-          <w:i w:val="0"/>
-        </w:rPr>
-        <w:t>, so a user cannot make themselves an admin by changing the form data.</w:t>
+        <w:t>. The invitation holds the person's email, the role they will get, a secret token, and a date when it expires. The system rejects a token if it is unknown, already used, expired, or if the email already has an account. The role comes from the invitation and not from the sign up form, so a user cannot make themselves an admin by changing the form data.</w:t>
       </w:r>
     </w:p>
     <w:p>
@@ -2228,7 +1997,7 @@
           <w:b w:val="0"/>
           <w:i/>
         </w:rPr>
-        <w:t>Figure 2.1: Admin Invitation Screen Showing the Sign-Up Link</w:t>
+        <w:t>Figure 2.1: Admin Invitation Screen Showing the Sign Up Link</w:t>
       </w:r>
     </w:p>
     <w:p>
@@ -2260,21 +2029,7 @@
           <w:b w:val="0"/>
           <w:i w:val="0"/>
         </w:rPr>
-        <w:t xml:space="preserve"> The rules about who can do what are saved in the database as </w:t>
-      </w:r>
-      <w:r>
-        <w:rPr>
-          <w:b/>
-          <w:i w:val="0"/>
-        </w:rPr>
-        <w:t>35 permission keys</w:t>
-      </w:r>
-      <w:r>
-        <w:rPr>
-          <w:b w:val="0"/>
-          <w:i w:val="0"/>
-        </w:rPr>
-        <w:t xml:space="preserve">, sorted into eight groups (Course Management, User &amp; Access Management, System Configuration, Assessment, Forum, Credentialing, Progress, Profile). Each key is given to one or more roles. When the code asks </w:t>
+        <w:t xml:space="preserve"> The rules about who can do what are saved in the database as 35 permission keys, sorted into eight groups. The groups are Course Management, User and Access Management, System Configuration, Assessment, Forum, Credentialing, Progress and Profile. Each key is given to one or more roles. When the code asks </w:t>
       </w:r>
       <w:r>
         <w:rPr>
@@ -2291,21 +2046,7 @@
           <w:b w:val="0"/>
           <w:i w:val="0"/>
         </w:rPr>
-        <w:t xml:space="preserve">, Laravel checks these database tables. </w:t>
-      </w:r>
-      <w:r>
-        <w:rPr>
-          <w:b/>
-          <w:i w:val="0"/>
-        </w:rPr>
-        <w:t>There is no line of code anywhere that says "if the user is an admin".</w:t>
-      </w:r>
-      <w:r>
-        <w:rPr>
-          <w:b w:val="0"/>
-          <w:i w:val="0"/>
-        </w:rPr>
-        <w:t xml:space="preserve"> This means an admin can tick and untick boxes on a screen, and the change works on the very next page load, with no programming needed.</w:t>
+        <w:t>, Laravel checks these database tables. There is no line of code anywhere that says if the user is an admin. This means an admin can tick and untick boxes on a screen, and the change works on the very next page load, with no programming needed.</w:t>
       </w:r>
     </w:p>
     <w:p>
@@ -2528,49 +2269,7 @@
           <w:b w:val="0"/>
           <w:i w:val="0"/>
         </w:rPr>
-        <w:t xml:space="preserve"> Admins can turn accounts on and off, delete them, and unlock them. If someone gets the password wrong </w:t>
-      </w:r>
-      <w:r>
-        <w:rPr>
-          <w:b/>
-          <w:i w:val="0"/>
-        </w:rPr>
-        <w:t>five times in a row</w:t>
-      </w:r>
-      <w:r>
-        <w:rPr>
-          <w:b w:val="0"/>
-          <w:i w:val="0"/>
-        </w:rPr>
-        <w:t xml:space="preserve">, the account locks, and </w:t>
-      </w:r>
-      <w:r>
-        <w:rPr>
-          <w:b/>
-          <w:i w:val="0"/>
-        </w:rPr>
-        <w:t>only an admin can unlock it</w:t>
-      </w:r>
-      <w:r>
-        <w:rPr>
-          <w:b w:val="0"/>
-          <w:i w:val="0"/>
-        </w:rPr>
-        <w:t xml:space="preserve">. A new password cannot be the same as any of the last three. New users must change their password the first time they log in. Every dangerous action (like deleting an account) asks the admin to type </w:t>
-      </w:r>
-      <w:r>
-        <w:rPr>
-          <w:b/>
-          <w:i w:val="0"/>
-        </w:rPr>
-        <w:t>their own password</w:t>
-      </w:r>
-      <w:r>
-        <w:rPr>
-          <w:b w:val="0"/>
-          <w:i w:val="0"/>
-        </w:rPr>
-        <w:t xml:space="preserve"> on a separate page first, so one accidental click can never change an account.</w:t>
+        <w:t xml:space="preserve"> Admins can turn accounts on and off, delete them, and unlock them. If someone gets the password wrong five times in a row, the account locks, and only an admin can unlock it. A new password cannot be the same as any of the last three. New users must change their password the first time they log in. Every dangerous action, such as deleting an account, asks the admin to type their own password on a separate page first. This means one accidental click can never change an account.</w:t>
       </w:r>
     </w:p>
     <w:p>
@@ -2803,21 +2502,7 @@
           <w:b w:val="0"/>
           <w:i w:val="0"/>
         </w:rPr>
-        <w:t xml:space="preserve"> table. Each row records </w:t>
-      </w:r>
-      <w:r>
-        <w:rPr>
-          <w:b/>
-          <w:i w:val="0"/>
-        </w:rPr>
-        <w:t>who did it, what they did, what they did it to, their IP address, and their browser</w:t>
-      </w:r>
-      <w:r>
-        <w:rPr>
-          <w:b w:val="0"/>
-          <w:i w:val="0"/>
-        </w:rPr>
-        <w:t xml:space="preserve">. The actions saved include </w:t>
+        <w:t xml:space="preserve"> table. Each row records who did it, what they did, what they did it to, their IP address, and their browser. The actions saved include </w:t>
       </w:r>
       <w:r>
         <w:rPr>
@@ -2953,21 +2638,7 @@
           <w:b w:val="0"/>
           <w:i w:val="0"/>
         </w:rPr>
-        <w:t xml:space="preserve">. Instead of editing the login code, the system listens to Laravel's own login events. This means </w:t>
-      </w:r>
-      <w:r>
-        <w:rPr>
-          <w:b/>
-          <w:i w:val="0"/>
-        </w:rPr>
-        <w:t>any new login method added later is recorded automatically</w:t>
-      </w:r>
-      <w:r>
-        <w:rPr>
-          <w:b w:val="0"/>
-          <w:i w:val="0"/>
-        </w:rPr>
-        <w:t>.</w:t>
+        <w:t>. Instead of editing the login code, the system listens to Laravel's own login events. This means any new login method added later is recorded automatically.</w:t>
       </w:r>
     </w:p>
     <w:p>
@@ -3151,21 +2822,7 @@
           <w:b w:val="0"/>
           <w:i w:val="0"/>
         </w:rPr>
-        <w:t xml:space="preserve"> Progress is saved </w:t>
-      </w:r>
-      <w:r>
-        <w:rPr>
-          <w:b/>
-          <w:i w:val="0"/>
-        </w:rPr>
-        <w:t>for each student in each course</w:t>
-      </w:r>
-      <w:r>
-        <w:rPr>
-          <w:b w:val="0"/>
-          <w:i w:val="0"/>
-        </w:rPr>
-        <w:t>, not as one overall number. The system works it out from three things: quizzes passed, assignments handed in, and joining the course forum. The importance of each (normally quiz 50%, assignment 40%, forum 10%) is stored in a settings table, so an admin can change the balance without touching code. Every time progress is recalculated, the system saves a snapshot. These snapshots are what let the student dashboard draw a line chart of progress over time.</w:t>
+        <w:t xml:space="preserve"> Progress is saved for each student in each course, not as one overall number. The system works it out from three things: quizzes passed, assignments handed in, and joining the course forum. The importance of each one, normally quiz 50%, assignment 40% and forum 10%, is stored in a settings table. This lets an admin change the balance without touching any code. Every time progress is recalculated, the system saves a snapshot. These snapshots are what let the student dashboard draw a line chart of progress over time.</w:t>
       </w:r>
     </w:p>
     <w:p>
@@ -3342,112 +2999,13 @@
           <w:b w:val="0"/>
           <w:i w:val="0"/>
         </w:rPr>
-        <w:t xml:space="preserve"> When a student finishes a course, the system makes a certificate. It creates a unique ID using letters and numbers that are </w:t>
-      </w:r>
-      <w:r>
-        <w:rPr>
-          <w:b/>
-          <w:i w:val="0"/>
-        </w:rPr>
-        <w:t>hard to mix up</w:t>
-      </w:r>
-      <w:r>
-        <w:rPr>
-          <w:b w:val="0"/>
-          <w:i w:val="0"/>
-        </w:rPr>
-        <w:t xml:space="preserve"> — the letters I, L, O and U are removed so that </w:t>
-      </w:r>
-      <w:r>
-        <w:rPr>
-          <w:rFonts w:ascii="Consolas" w:hAnsi="Consolas"/>
-          <w:b w:val="0"/>
-          <w:i w:val="0"/>
-          <w:color w:val="C0333C"/>
-          <w:sz w:val="19"/>
-        </w:rPr>
-        <w:t>1</w:t>
-      </w:r>
-      <w:r>
-        <w:rPr>
-          <w:b w:val="0"/>
-          <w:i w:val="0"/>
-        </w:rPr>
-        <w:t xml:space="preserve"> is never confused with </w:t>
-      </w:r>
-      <w:r>
-        <w:rPr>
-          <w:rFonts w:ascii="Consolas" w:hAnsi="Consolas"/>
-          <w:b w:val="0"/>
-          <w:i w:val="0"/>
-          <w:color w:val="C0333C"/>
-          <w:sz w:val="19"/>
-        </w:rPr>
-        <w:t>I</w:t>
-      </w:r>
-      <w:r>
-        <w:rPr>
-          <w:b w:val="0"/>
-          <w:i w:val="0"/>
-        </w:rPr>
-        <w:t xml:space="preserve"> or </w:t>
-      </w:r>
-      <w:r>
-        <w:rPr>
-          <w:rFonts w:ascii="Consolas" w:hAnsi="Consolas"/>
-          <w:b w:val="0"/>
-          <w:i w:val="0"/>
-          <w:color w:val="C0333C"/>
-          <w:sz w:val="19"/>
-        </w:rPr>
-        <w:t>L</w:t>
-      </w:r>
-      <w:r>
-        <w:rPr>
-          <w:b w:val="0"/>
-          <w:i w:val="0"/>
-        </w:rPr>
-        <w:t xml:space="preserve">, and </w:t>
-      </w:r>
-      <w:r>
-        <w:rPr>
-          <w:rFonts w:ascii="Consolas" w:hAnsi="Consolas"/>
-          <w:b w:val="0"/>
-          <w:i w:val="0"/>
-          <w:color w:val="C0333C"/>
-          <w:sz w:val="19"/>
-        </w:rPr>
-        <w:t>0</w:t>
-      </w:r>
-      <w:r>
-        <w:rPr>
-          <w:b w:val="0"/>
-          <w:i w:val="0"/>
-        </w:rPr>
-        <w:t xml:space="preserve"> is never confused with </w:t>
-      </w:r>
-      <w:r>
-        <w:rPr>
-          <w:rFonts w:ascii="Consolas" w:hAnsi="Consolas"/>
-          <w:b w:val="0"/>
-          <w:i w:val="0"/>
-          <w:color w:val="C0333C"/>
-          <w:sz w:val="19"/>
-        </w:rPr>
-        <w:t>O</w:t>
-      </w:r>
-      <w:r>
-        <w:rPr>
-          <w:b w:val="0"/>
-          <w:i w:val="0"/>
-        </w:rPr>
-        <w:t>. It then adds a SHA-256 security code and makes a PDF with a QR code inside it.</w:t>
+        <w:t xml:space="preserve"> When a student finishes a course, the system makes a certificate. It creates a unique ID using letters and numbers that are hard to mix up. The letters I, L, O and U are removed so that the digit 1 is never confused with I or L, and the digit 0 is never confused with O. It then adds a SHA-256 security code and makes a PDF with a QR code inside it.</w:t>
       </w:r>
     </w:p>
     <w:p>
       <w:r>
         <w:rPr>
-          <w:b/>
+          <w:b w:val="0"/>
           <w:i w:val="0"/>
         </w:rPr>
         <w:t>Two separate tests must both pass before a certificate is given:</w:t>
@@ -3462,21 +3020,7 @@
           <w:b w:val="0"/>
           <w:i w:val="0"/>
         </w:rPr>
-        <w:t xml:space="preserve">the student's progress must reach the required percentage (this shows they </w:t>
-      </w:r>
-      <w:r>
-        <w:rPr>
-          <w:b/>
-          <w:i w:val="0"/>
-        </w:rPr>
-        <w:t>did the work</w:t>
-      </w:r>
-      <w:r>
-        <w:rPr>
-          <w:b w:val="0"/>
-          <w:i w:val="0"/>
-        </w:rPr>
-        <w:t>), and</w:t>
+        <w:t>The student's progress must reach the required percentage. This shows they did the work.</w:t>
       </w:r>
     </w:p>
     <w:p>
@@ -3488,21 +3032,7 @@
           <w:b w:val="0"/>
           <w:i w:val="0"/>
         </w:rPr>
-        <w:t xml:space="preserve">the student's average mark must be a pass (this shows they </w:t>
-      </w:r>
-      <w:r>
-        <w:rPr>
-          <w:b/>
-          <w:i w:val="0"/>
-        </w:rPr>
-        <w:t>understood the work</w:t>
-      </w:r>
-      <w:r>
-        <w:rPr>
-          <w:b w:val="0"/>
-          <w:i w:val="0"/>
-        </w:rPr>
-        <w:t>).</w:t>
+        <w:t>The student's average mark must be a pass. This shows they understood the work.</w:t>
       </w:r>
     </w:p>
     <w:p>
@@ -3511,7 +3041,7 @@
           <w:b w:val="0"/>
           <w:i w:val="0"/>
         </w:rPr>
-        <w:t>Only checking progress was not enough. A hard-working student who understood very little could still reach 80% just by joining in. That produced certificates showing a failing average mark, which a real certificate must never do.</w:t>
+        <w:t>Only checking progress was not enough. A hard working student who understood very little could still reach 80% just by joining in. That produced certificates showing a failing average mark, which a real certificate must never do.</w:t>
       </w:r>
     </w:p>
     <w:p>
@@ -3710,35 +3240,7 @@
           <w:b w:val="0"/>
           <w:i w:val="0"/>
         </w:rPr>
-        <w:t xml:space="preserve"> without logging in. The page shows one of five answers: </w:t>
-      </w:r>
-      <w:r>
-        <w:rPr>
-          <w:b/>
-          <w:i w:val="0"/>
-        </w:rPr>
-        <w:t>VALID, REVOKED, TAMPERED, EXPIRED</w:t>
-      </w:r>
-      <w:r>
-        <w:rPr>
-          <w:b w:val="0"/>
-          <w:i w:val="0"/>
-        </w:rPr>
-        <w:t xml:space="preserve"> or </w:t>
-      </w:r>
-      <w:r>
-        <w:rPr>
-          <w:b/>
-          <w:i w:val="0"/>
-        </w:rPr>
-        <w:t>NOT FOUND</w:t>
-      </w:r>
-      <w:r>
-        <w:rPr>
-          <w:b w:val="0"/>
-          <w:i w:val="0"/>
-        </w:rPr>
-        <w:t>. An admin can cancel (revoke) a certificate and must give a reason. After that, the public page shows REVOKED straight away and the PDF can no longer be downloaded.</w:t>
+        <w:t xml:space="preserve"> without logging in. The page shows one of five answers: VALID, REVOKED, TAMPERED, EXPIRED or NOT FOUND. An admin can cancel a certificate and must give a reason. After that, the public page shows REVOKED straight away and the PDF can no longer be downloaded.</w:t>
       </w:r>
     </w:p>
     <w:p>
@@ -3907,7 +3409,7 @@
           <w:b w:val="0"/>
           <w:i/>
         </w:rPr>
-        <w:t>Figure 2.7: Public Checking Page Showing VALID (Not Logged In)</w:t>
+        <w:t>Figure 2.7: Public Checking Page Showing VALID While Not Logged In</w:t>
       </w:r>
     </w:p>
     <w:p>
@@ -3948,35 +3450,7 @@
           <w:b w:val="0"/>
           <w:i w:val="0"/>
         </w:rPr>
-        <w:t xml:space="preserve"> Badges and certificate rules are saved as data, not written into the code. Each rule has a name, description, award type (badge or certificate), tier, icon or certificate design, a condition, a number, an optional subject, and an on/off switch. There are </w:t>
-      </w:r>
-      <w:r>
-        <w:rPr>
-          <w:b/>
-          <w:i w:val="0"/>
-        </w:rPr>
-        <w:t>nine conditions</w:t>
-      </w:r>
-      <w:r>
-        <w:rPr>
-          <w:b w:val="0"/>
-          <w:i w:val="0"/>
-        </w:rPr>
-        <w:t xml:space="preserve"> to choose from. This is on purpose </w:t>
-      </w:r>
-      <w:r>
-        <w:rPr>
-          <w:b/>
-          <w:i w:val="0"/>
-        </w:rPr>
-        <w:t>not</w:t>
-      </w:r>
-      <w:r>
-        <w:rPr>
-          <w:b w:val="0"/>
-          <w:i w:val="0"/>
-        </w:rPr>
-        <w:t xml:space="preserve"> a place where admins write code. They simply pick a condition from a list and type a number. Because of this, no rule an admin creates can crash the system, get stuck in a loop, or read data it should not see.</w:t>
+        <w:t xml:space="preserve"> Badges and certificate rules are saved as data, not written into the code. Each rule has a name, a description, an award type of either badge or certificate, a tier, an icon or certificate design, a condition, a number, an optional subject, and an on or off switch. There are nine conditions to choose from. This is deliberately not a place where admins write code. They simply pick a condition from a list and type a number. Because of this, no rule an admin creates can crash the system, get stuck in a loop, or read data it should not see.</w:t>
       </w:r>
     </w:p>
     <w:p>
@@ -4266,21 +3740,7 @@
           <w:b w:val="0"/>
           <w:i w:val="0"/>
         </w:rPr>
-        <w:t xml:space="preserve"> Module 1 owns the notification inbox: the bell icon with its unread count, the history page, the "mark as read" buttons, and the settings where each user can switch notification types on or off. The system checks these settings </w:t>
-      </w:r>
-      <w:r>
-        <w:rPr>
-          <w:b/>
-          <w:i w:val="0"/>
-        </w:rPr>
-        <w:t>before saving a notification</w:t>
-      </w:r>
-      <w:r>
-        <w:rPr>
-          <w:b w:val="0"/>
-          <w:i w:val="0"/>
-        </w:rPr>
-        <w:t>. So turning a type off stops it being created at all, rather than just hiding it.</w:t>
+        <w:t xml:space="preserve"> Module 1 owns the notification inbox. This includes the bell icon with its unread count, the history page, the mark as read buttons, and the settings where each user can switch notification types on or off. The system checks these settings before saving a notification. So turning a type off stops it being created at all, rather than just hiding it.</w:t>
       </w:r>
     </w:p>
     <w:p>
@@ -4512,21 +3972,7 @@
           <w:b w:val="0"/>
           <w:i w:val="0"/>
         </w:rPr>
-        <w:t xml:space="preserve">The diagram below shows the entity classes using </w:t>
-      </w:r>
-      <w:r>
-        <w:rPr>
-          <w:b/>
-          <w:i w:val="0"/>
-        </w:rPr>
-        <w:t>object references</w:t>
-      </w:r>
-      <w:r>
-        <w:rPr>
-          <w:b w:val="0"/>
-          <w:i w:val="0"/>
-        </w:rPr>
-        <w:t xml:space="preserve"> (one object pointing to another object) instead of database foreign keys.</w:t>
+        <w:t>The diagram below shows the entity classes using object references, meaning one object points to another object, instead of database foreign keys.</w:t>
       </w:r>
     </w:p>
     <w:p>
@@ -4549,21 +3995,7 @@
           <w:b w:val="0"/>
           <w:i w:val="0"/>
         </w:rPr>
-        <w:t xml:space="preserve"> An entity class diagram is </w:t>
-      </w:r>
-      <w:r>
-        <w:rPr>
-          <w:b/>
-          <w:i w:val="0"/>
-        </w:rPr>
-        <w:t>not</w:t>
-      </w:r>
-      <w:r>
-        <w:rPr>
-          <w:b w:val="0"/>
-          <w:i w:val="0"/>
-        </w:rPr>
-        <w:t xml:space="preserve"> an ERD. Show each class as a box with its attributes, its methods, and lines connecting it to other classes with multiplicities (1, 0..*). Draw it in draw.io, Visual Paradigm or StarUML. Save it as a PNG, upload it to Google Drive, and paste both the link and the picture here — the same way the sample report did.</w:t>
+        <w:t xml:space="preserve"> An entity class diagram is not an ERD. Show each class as a box with its attributes, its methods, and lines connecting it to other classes with multiplicities such as 1 or 0..*. Draw it in draw.io, Visual Paradigm or StarUML. Save it as a PNG, upload it to Google Drive, and paste both the link and the picture here, the same way the sample report did.</w:t>
       </w:r>
     </w:p>
     <w:p>
@@ -4595,7 +4027,7 @@
           <w:b w:val="0"/>
           <w:i/>
         </w:rPr>
-        <w:t>Figure 3.1: Entity Class Diagram — Module 1 Identity, Access &amp; Digital Credentialing</w:t>
+        <w:t>Figure 3.1: Entity Class Diagram for Module 1 Identity, Access and Digital Credentialing</w:t>
       </w:r>
     </w:p>
     <w:p>
@@ -4737,21 +4169,7 @@
           <w:b w:val="0"/>
           <w:i w:val="0"/>
         </w:rPr>
-        <w:t xml:space="preserve">The classes are written in PHP using Laravel's Eloquent ORM. Relationships are written as </w:t>
-      </w:r>
-      <w:r>
-        <w:rPr>
-          <w:b/>
-          <w:i w:val="0"/>
-        </w:rPr>
-        <w:t>methods</w:t>
-      </w:r>
-      <w:r>
-        <w:rPr>
-          <w:b w:val="0"/>
-          <w:i w:val="0"/>
-        </w:rPr>
-        <w:t xml:space="preserve"> (</w:t>
+        <w:t xml:space="preserve">The classes are written in PHP using Laravel's Eloquent ORM. Relationships are written as methods such as </w:t>
       </w:r>
       <w:r>
         <w:rPr>
@@ -4785,7 +4203,7 @@
           <w:b w:val="0"/>
           <w:i w:val="0"/>
         </w:rPr>
-        <w:t xml:space="preserve">, </w:t>
+        <w:t xml:space="preserve"> and </w:t>
       </w:r>
       <w:r>
         <w:rPr>
@@ -4802,7 +4220,7 @@
           <w:b w:val="0"/>
           <w:i w:val="0"/>
         </w:rPr>
-        <w:t>), so the code never has to write SQL.</w:t>
+        <w:t>, so the code never has to write SQL.</w:t>
       </w:r>
     </w:p>
     <w:p>
@@ -4845,21 +4263,7 @@
           <w:b w:val="0"/>
           <w:i w:val="0"/>
         </w:rPr>
-        <w:t xml:space="preserve"> </w:t>
-      </w:r>
-      <w:r>
-        <w:rPr>
-          <w:b/>
-          <w:i w:val="0"/>
-        </w:rPr>
-        <w:t>object</w:t>
-      </w:r>
-      <w:r>
-        <w:rPr>
-          <w:b w:val="0"/>
-          <w:i w:val="0"/>
-        </w:rPr>
-        <w:t xml:space="preserve">. So </w:t>
+        <w:t xml:space="preserve"> object. So </w:t>
       </w:r>
       <w:r>
         <w:rPr>
@@ -4876,7 +4280,7 @@
           <w:b w:val="0"/>
           <w:i w:val="0"/>
         </w:rPr>
-        <w:t xml:space="preserve"> reads the student's name by following the link between objects, not by joining tables:</w:t>
+        <w:t xml:space="preserve"> reads the student's name by following the link between objects, not by joining tables.</w:t>
       </w:r>
     </w:p>
     <w:p>
@@ -5082,21 +4486,7 @@
           <w:b w:val="0"/>
           <w:i w:val="0"/>
         </w:rPr>
-        <w:t xml:space="preserve">For Module 1, I used the </w:t>
-      </w:r>
-      <w:r>
-        <w:rPr>
-          <w:b/>
-          <w:i w:val="0"/>
-        </w:rPr>
-        <w:t>Facade Design Pattern</w:t>
-      </w:r>
-      <w:r>
-        <w:rPr>
-          <w:b w:val="0"/>
-          <w:i w:val="0"/>
-        </w:rPr>
-        <w:t xml:space="preserve"> (a Gang of Four Structural Pattern).</w:t>
+        <w:t>For Module 1, I used the Facade Design Pattern, which is a Gang of Four Structural Pattern.</w:t>
       </w:r>
     </w:p>
     <w:p>
@@ -5114,21 +4504,7 @@
           <w:b w:val="0"/>
           <w:i w:val="0"/>
         </w:rPr>
-        <w:t xml:space="preserve">The Facade Pattern </w:t>
-      </w:r>
-      <w:r>
-        <w:rPr>
-          <w:b w:val="0"/>
-          <w:i/>
-        </w:rPr>
-        <w:t>"provides a unified interface to a set of interfaces in a subsystem. Facade defines a higher-level interface that makes the subsystem easier to use"</w:t>
-      </w:r>
-      <w:r>
-        <w:rPr>
-          <w:b w:val="0"/>
-          <w:i w:val="0"/>
-        </w:rPr>
-        <w:t xml:space="preserve"> (Gamma, Helm, Johnson &amp; Vlissides, 1994).</w:t>
+        <w:t>Gamma, Helm, Johnson and Vlissides (1994) describe the Facade Pattern as one that gives a single, unified way into a group of interfaces in a subsystem. The Facade sits at a higher level than those interfaces and makes the whole subsystem easier to use.</w:t>
       </w:r>
     </w:p>
     <w:p>
@@ -5137,7 +4513,7 @@
           <w:b w:val="0"/>
           <w:i w:val="0"/>
         </w:rPr>
-        <w:t>In simple words: sometimes a job needs many different classes working together in the right order. Without a Facade, every part of the program that wants that job done must know all those classes, how to create them, and what order to call them in. That is a lot to remember, and if the classes ever change, every caller must be fixed too.</w:t>
+        <w:t>In simple words, some jobs need many different classes working together in the right order. Without a Facade, every part of the program that wants that job done must know all those classes, how to create them, and what order to call them in. That is a lot to remember. It also means that if the classes ever change, every caller must be fixed as well.</w:t>
       </w:r>
     </w:p>
     <w:p>
@@ -5146,49 +4522,7 @@
           <w:b w:val="0"/>
           <w:i w:val="0"/>
         </w:rPr>
-        <w:t xml:space="preserve">A Facade is </w:t>
-      </w:r>
-      <w:r>
-        <w:rPr>
-          <w:b/>
-          <w:i w:val="0"/>
-        </w:rPr>
-        <w:t>one class that stands in front of all the others</w:t>
-      </w:r>
-      <w:r>
-        <w:rPr>
-          <w:b w:val="0"/>
-          <w:i w:val="0"/>
-        </w:rPr>
-        <w:t xml:space="preserve">. It offers a few simple methods that say </w:t>
-      </w:r>
-      <w:r>
-        <w:rPr>
-          <w:b w:val="0"/>
-          <w:i/>
-        </w:rPr>
-        <w:t>what you want</w:t>
-      </w:r>
-      <w:r>
-        <w:rPr>
-          <w:b w:val="0"/>
-          <w:i w:val="0"/>
-        </w:rPr>
-        <w:t xml:space="preserve">, not </w:t>
-      </w:r>
-      <w:r>
-        <w:rPr>
-          <w:b w:val="0"/>
-          <w:i/>
-        </w:rPr>
-        <w:t>how it is done</w:t>
-      </w:r>
-      <w:r>
-        <w:rPr>
-          <w:b w:val="0"/>
-          <w:i w:val="0"/>
-        </w:rPr>
-        <w:t>. The caller only talks to the Facade.</w:t>
+        <w:t>A Facade is one class that stands in front of all the others. It offers a few simple methods that say what you want, not how it is done. The caller only talks to the Facade.</w:t>
       </w:r>
     </w:p>
     <w:p>
@@ -5233,7 +4567,7 @@
           <w:b w:val="0"/>
           <w:i w:val="0"/>
         </w:rPr>
-        <w:t xml:space="preserve">. It offers three simple methods — </w:t>
+        <w:t xml:space="preserve">. It offers three simple methods, which are </w:t>
       </w:r>
       <w:r>
         <w:rPr>
@@ -5320,7 +4654,7 @@
           <w:b w:val="0"/>
           <w:i w:val="0"/>
         </w:rPr>
-        <w:t xml:space="preserve"> that do the real work — </w:t>
+        <w:t xml:space="preserve"> that do the real work. They are </w:t>
       </w:r>
       <w:r>
         <w:rPr>
@@ -5405,7 +4739,7 @@
           <w:b w:val="0"/>
           <w:i w:val="0"/>
         </w:rPr>
-        <w:t xml:space="preserve"> (which passes condition checks to </w:t>
+        <w:t xml:space="preserve">. The last one passes condition checks on to </w:t>
       </w:r>
       <w:r>
         <w:rPr>
@@ -5422,7 +4756,7 @@
           <w:b w:val="0"/>
           <w:i w:val="0"/>
         </w:rPr>
-        <w:t>).</w:t>
+        <w:t>.</w:t>
       </w:r>
     </w:p>
     <w:p>
@@ -5475,21 +4809,7 @@
           <w:b w:val="0"/>
           <w:i w:val="0"/>
         </w:rPr>
-        <w:t xml:space="preserve"> event. They only know the Facade. They </w:t>
-      </w:r>
-      <w:r>
-        <w:rPr>
-          <w:b/>
-          <w:i w:val="0"/>
-        </w:rPr>
-        <w:t>never import</w:t>
-      </w:r>
-      <w:r>
-        <w:rPr>
-          <w:b w:val="0"/>
-          <w:i w:val="0"/>
-        </w:rPr>
-        <w:t xml:space="preserve"> DomPDF, the QR code maker, the settings table or the badge rules.</w:t>
+        <w:t xml:space="preserve"> event. They only know the Facade. They never import DomPDF, the QR code maker, the settings table or the badge rules.</w:t>
       </w:r>
     </w:p>
     <w:p>
@@ -5502,69 +4822,21 @@
       </w:r>
     </w:p>
     <w:p>
-      <w:pPr>
-        <w:pStyle w:val="ListBullet"/>
-      </w:pPr>
-      <w:r>
-        <w:rPr>
-          <w:b/>
-          <w:i w:val="0"/>
-        </w:rPr>
-        <w:t>Facade does not block the subsystem.</w:t>
-      </w:r>
-      <w:r>
-        <w:rPr>
-          <w:b w:val="0"/>
-          <w:i w:val="0"/>
-        </w:rPr>
-        <w:t xml:space="preserve"> The five helper classes can still be used directly and tested on their own. The Facade only adds an easier way in. This is different from </w:t>
-      </w:r>
-      <w:r>
-        <w:rPr>
-          <w:b/>
-          <w:i w:val="0"/>
-        </w:rPr>
-        <w:t>Proxy</w:t>
-      </w:r>
-      <w:r>
-        <w:rPr>
-          <w:b w:val="0"/>
-          <w:i w:val="0"/>
-        </w:rPr>
-        <w:t>, which controls access to one object.</w:t>
+      <w:r>
+        <w:rPr>
+          <w:b w:val="0"/>
+          <w:i w:val="0"/>
+        </w:rPr>
+        <w:t>A Facade does not block the subsystem. The five helper classes can still be used directly and tested on their own. The Facade only adds an easier way in. This is different from Proxy, which controls access to one object.</w:t>
       </w:r>
     </w:p>
     <w:p>
-      <w:pPr>
-        <w:pStyle w:val="ListBullet"/>
-      </w:pPr>
-      <w:r>
-        <w:rPr>
-          <w:b/>
-          <w:i w:val="0"/>
-        </w:rPr>
-        <w:t>Facade creates a new, simpler interface.</w:t>
-      </w:r>
-      <w:r>
-        <w:rPr>
-          <w:b w:val="0"/>
-          <w:i w:val="0"/>
-        </w:rPr>
-        <w:t xml:space="preserve"> This is different from </w:t>
-      </w:r>
-      <w:r>
-        <w:rPr>
-          <w:b/>
-          <w:i w:val="0"/>
-        </w:rPr>
-        <w:t>Adapter</w:t>
-      </w:r>
-      <w:r>
-        <w:rPr>
-          <w:b w:val="0"/>
-          <w:i w:val="0"/>
-        </w:rPr>
-        <w:t xml:space="preserve"> (used by Module 2), which changes one interface into another shape without making it simpler. Adapter makes two different things look the same; Facade makes many things look like one.</w:t>
+      <w:r>
+        <w:rPr>
+          <w:b w:val="0"/>
+          <w:i w:val="0"/>
+        </w:rPr>
+        <w:t>A Facade also creates a new and simpler interface. This is different from Adapter, which Module 2 uses. Adapter changes one interface into another shape without making it simpler. Adapter makes two different things look the same, while Facade makes many things look like one.</w:t>
       </w:r>
     </w:p>
     <w:p>
@@ -5587,49 +4859,7 @@
           <w:b w:val="0"/>
           <w:i w:val="0"/>
         </w:rPr>
-        <w:t xml:space="preserve"> Module 1 first used the </w:t>
-      </w:r>
-      <w:r>
-        <w:rPr>
-          <w:b/>
-          <w:i w:val="0"/>
-        </w:rPr>
-        <w:t>Singleton</w:t>
-      </w:r>
-      <w:r>
-        <w:rPr>
-          <w:b w:val="0"/>
-          <w:i w:val="0"/>
-        </w:rPr>
-        <w:t xml:space="preserve"> pattern. The assignment says </w:t>
-      </w:r>
-      <w:r>
-        <w:rPr>
-          <w:b w:val="0"/>
-          <w:i/>
-        </w:rPr>
-        <w:t>"Singleton and MVC design patterns are NOT counted as one of the chosen design patterns"</w:t>
-      </w:r>
-      <w:r>
-        <w:rPr>
-          <w:b w:val="0"/>
-          <w:i w:val="0"/>
-        </w:rPr>
-        <w:t xml:space="preserve">, so I changed it to Facade. Only the way the object is created changed — </w:t>
-      </w:r>
-      <w:r>
-        <w:rPr>
-          <w:b/>
-          <w:i w:val="0"/>
-        </w:rPr>
-        <w:t>every method name, every parameter and every feature stayed exactly the same</w:t>
-      </w:r>
-      <w:r>
-        <w:rPr>
-          <w:b w:val="0"/>
-          <w:i w:val="0"/>
-        </w:rPr>
-        <w:t>.</w:t>
+        <w:t xml:space="preserve"> Module 1 first used the Singleton pattern. The assignment states that Singleton and MVC design patterns are not counted as one of the chosen design patterns, so I changed it to Facade. Only the way the object is created changed. Every method name, every parameter and every feature stayed exactly the same.</w:t>
       </w:r>
     </w:p>
     <w:p>
@@ -5661,7 +4891,7 @@
           <w:b w:val="0"/>
           <w:i/>
         </w:rPr>
-        <w:t>Figure 4.1: Facade Pattern Class Diagram — CredentialAuthority and Its Subsystem</w:t>
+        <w:t>Figure 4.1: Facade Pattern Class Diagram Showing CredentialAuthority and Its Subsystem</w:t>
       </w:r>
     </w:p>
     <w:p>
@@ -5741,7 +4971,7 @@
         <w:br/>
         <w:t xml:space="preserve">                                            +----------------------+</w:t>
         <w:br/>
-        <w:t xml:space="preserve">        THE SUBSYSTEM - 5 helper classes, 4 outside libraries</w:t>
+        <w:t xml:space="preserve">        THE SUBSYSTEM: 5 helper classes and 4 outside libraries</w:t>
       </w:r>
     </w:p>
     <w:p>
@@ -5767,7 +4997,7 @@
           <w:i w:val="0"/>
           <w:color w:val="1F3864"/>
         </w:rPr>
-        <w:t>1. Helper Class — Making the Certificate ID (</w:t>
+        <w:t>1. Helper Class for Making the Certificate ID (</w:t>
       </w:r>
       <w:r>
         <w:rPr>
@@ -5818,7 +5048,9 @@
         <w:br/>
         <w:t xml:space="preserve">    // The letters I, L, O and U are missing on purpose, so a printed ID</w:t>
         <w:br/>
-        <w:t xml:space="preserve">    // can never be misread (1 vs I vs L, or 0 vs O).</w:t>
+        <w:t xml:space="preserve">    // can never be misread. 1 is never confused with I or L, and 0 is</w:t>
+        <w:br/>
+        <w:t xml:space="preserve">    // never confused with O.</w:t>
         <w:br/>
         <w:t xml:space="preserve">    private const BASE32_ALPHABET = '0123456789ABCDEFGHJKMNPQRSTVWXYZ';</w:t>
         <w:br/>
@@ -5891,7 +5123,7 @@
           <w:i w:val="0"/>
           <w:color w:val="1F3864"/>
         </w:rPr>
-        <w:t>2. Helper Class — The Security Code (</w:t>
+        <w:t>2. Helper Class for the Security Code (</w:t>
       </w:r>
       <w:r>
         <w:rPr>
@@ -6093,7 +5325,7 @@
         <w:br/>
         <w:t xml:space="preserve">        // Everything inside runs together. If any step fails, all steps</w:t>
         <w:br/>
-        <w:t xml:space="preserve">        // are undone, so a half-made certificate can never exist.</w:t>
+        <w:t xml:space="preserve">        // are undone, so a half made certificate can never exist.</w:t>
         <w:br/>
         <w:t xml:space="preserve">        return DB::transaction(function () use ($student, $course, $template, $score) {</w:t>
         <w:br/>
@@ -6356,21 +5588,7 @@
           <w:b w:val="0"/>
           <w:i w:val="0"/>
         </w:rPr>
-        <w:t xml:space="preserve"> Making one certificate takes eleven steps: create a unique ID, make the security code, fill in the template wording, make the PDF, make the QR code, save the file, recalculate progress, save a progress snapshot, check every award rule, check for a finished learning path, and write the security log. That needs </w:t>
-      </w:r>
-      <w:r>
-        <w:rPr>
-          <w:b/>
-          <w:i w:val="0"/>
-        </w:rPr>
-        <w:t>five helper classes and four outside libraries</w:t>
-      </w:r>
-      <w:r>
-        <w:rPr>
-          <w:b w:val="0"/>
-          <w:i w:val="0"/>
-        </w:rPr>
-        <w:t xml:space="preserve">. Without the Facade, </w:t>
+        <w:t xml:space="preserve"> Making one certificate takes eleven steps. The system must create a unique ID, make the security code, fill in the template wording, make the PDF, make the QR code, save the file, recalculate progress, save a progress snapshot, check every award rule, check for a finished learning path, and write the security log. That needs five helper classes and four outside libraries. Without the Facade, </w:t>
       </w:r>
       <w:r>
         <w:rPr>
@@ -6387,21 +5605,7 @@
           <w:b w:val="0"/>
           <w:i w:val="0"/>
         </w:rPr>
-        <w:t xml:space="preserve"> would have to do all of this itself. A controller is not supposed to know about PDF libraries and QR codes, and doing so would break the </w:t>
-      </w:r>
-      <w:r>
-        <w:rPr>
-          <w:b/>
-          <w:i w:val="0"/>
-        </w:rPr>
-        <w:t>Single Responsibility Principle</w:t>
-      </w:r>
-      <w:r>
-        <w:rPr>
-          <w:b w:val="0"/>
-          <w:i w:val="0"/>
-        </w:rPr>
-        <w:t>.</w:t>
+        <w:t xml:space="preserve"> would have to do all of this itself. A controller is not supposed to know about PDF libraries and QR codes, and doing so would break the Single Responsibility Principle.</w:t>
       </w:r>
     </w:p>
     <w:p>
@@ -6417,7 +5621,7 @@
           <w:b w:val="0"/>
           <w:i w:val="0"/>
         </w:rPr>
-        <w:t xml:space="preserve"> During development I rewrote the PDF part, the badge engine and the progress calculation, and I added a whole sixth helper class (</w:t>
+        <w:t xml:space="preserve"> During development I rewrote the PDF part, the badge engine and the progress calculation. I also added a whole sixth helper class called </w:t>
       </w:r>
       <w:r>
         <w:rPr>
@@ -6434,21 +5638,7 @@
           <w:b w:val="0"/>
           <w:i w:val="0"/>
         </w:rPr>
-        <w:t xml:space="preserve">) when award rules became configurable by admins. </w:t>
-      </w:r>
-      <w:r>
-        <w:rPr>
-          <w:b/>
-          <w:i w:val="0"/>
-        </w:rPr>
-        <w:t>Not a single caller had to change</w:t>
-      </w:r>
-      <w:r>
-        <w:rPr>
-          <w:b w:val="0"/>
-          <w:i w:val="0"/>
-        </w:rPr>
-        <w:t xml:space="preserve">, because </w:t>
+        <w:t xml:space="preserve"> when award rules became configurable by admins. Not a single caller had to change, because </w:t>
       </w:r>
       <w:r>
         <w:rPr>
@@ -6499,21 +5689,7 @@
           <w:b w:val="0"/>
           <w:i w:val="0"/>
         </w:rPr>
-        <w:t xml:space="preserve"> kept the same names and parameters. This follows the </w:t>
-      </w:r>
-      <w:r>
-        <w:rPr>
-          <w:b/>
-          <w:i w:val="0"/>
-        </w:rPr>
-        <w:t>Open/Closed Principle</w:t>
-      </w:r>
-      <w:r>
-        <w:rPr>
-          <w:b w:val="0"/>
-          <w:i w:val="0"/>
-        </w:rPr>
-        <w:t>, and the project's own commit history proves it happened.</w:t>
+        <w:t xml:space="preserve"> kept the same names and parameters. This follows the Open Closed Principle, and the project's own commit history proves it happened.</w:t>
       </w:r>
     </w:p>
     <w:p>
@@ -6529,21 +5705,7 @@
           <w:b w:val="0"/>
           <w:i w:val="0"/>
         </w:rPr>
-        <w:t xml:space="preserve"> A Facade does not lock the subsystem away. Each of the five helpers can be created and tested by itself. This is important, because the old Singleton did the opposite: it made a second instance </w:t>
-      </w:r>
-      <w:r>
-        <w:rPr>
-          <w:b/>
-          <w:i w:val="0"/>
-        </w:rPr>
-        <w:t>impossible</w:t>
-      </w:r>
-      <w:r>
-        <w:rPr>
-          <w:b w:val="0"/>
-          <w:i w:val="0"/>
-        </w:rPr>
-        <w:t>, which stopped me testing pieces separately and gave nothing useful in return.</w:t>
+        <w:t xml:space="preserve"> A Facade does not lock the subsystem away. Each of the five helpers can be created and tested by itself. This is important, because the old Singleton did the opposite. It made a second instance impossible, which stopped me testing pieces separately and gave nothing useful in return.</w:t>
       </w:r>
     </w:p>
     <w:p>
@@ -6559,35 +5721,7 @@
           <w:b w:val="0"/>
           <w:i w:val="0"/>
         </w:rPr>
-        <w:t xml:space="preserve"> The Singleton was justified by saying two copies running at once could create the same certificate ID twice. In PHP this is </w:t>
-      </w:r>
-      <w:r>
-        <w:rPr>
-          <w:b/>
-          <w:i w:val="0"/>
-        </w:rPr>
-        <w:t>not true</w:t>
-      </w:r>
-      <w:r>
-        <w:rPr>
-          <w:b w:val="0"/>
-          <w:i w:val="0"/>
-        </w:rPr>
-        <w:t xml:space="preserve">. Every web request runs in its own separate process with its own memory, so two requests always had two separate objects anyway. The Singleton never protected anything across requests. What really stops duplicate IDs is the </w:t>
-      </w:r>
-      <w:r>
-        <w:rPr>
-          <w:b/>
-          <w:i w:val="0"/>
-        </w:rPr>
-        <w:t>unique index on the `certificates.credential_id` column</w:t>
-      </w:r>
-      <w:r>
-        <w:rPr>
-          <w:b w:val="0"/>
-          <w:i w:val="0"/>
-        </w:rPr>
-        <w:t xml:space="preserve"> plus the retry loop inside </w:t>
+        <w:t xml:space="preserve"> The Singleton was justified by saying two copies running at once could create the same certificate ID twice. In PHP this is not true. Every web request runs in its own separate process with its own memory, so two requests always had two separate objects anyway. The Singleton never protected anything across requests. What really stops duplicate IDs is the unique index on the </w:t>
       </w:r>
       <w:r>
         <w:rPr>
@@ -6597,6 +5731,23 @@
           <w:color w:val="C0333C"/>
           <w:sz w:val="19"/>
         </w:rPr>
+        <w:t>certificates.credential_id</w:t>
+      </w:r>
+      <w:r>
+        <w:rPr>
+          <w:b w:val="0"/>
+          <w:i w:val="0"/>
+        </w:rPr>
+        <w:t xml:space="preserve"> column, together with the retry loop inside </w:t>
+      </w:r>
+      <w:r>
+        <w:rPr>
+          <w:rFonts w:ascii="Consolas" w:hAnsi="Consolas"/>
+          <w:b w:val="0"/>
+          <w:i w:val="0"/>
+          <w:color w:val="C0333C"/>
+          <w:sz w:val="19"/>
+        </w:rPr>
         <w:t>CredentialIdGenerator</w:t>
       </w:r>
       <w:r>
@@ -6604,7 +5755,7 @@
           <w:b w:val="0"/>
           <w:i w:val="0"/>
         </w:rPr>
-        <w:t xml:space="preserve"> — and I did not change either of them. So moving to Facade lost nothing and gave the module a reason that actually holds up.</w:t>
+        <w:t>. I did not change either of them. So moving to Facade lost nothing and gave the module a reason that actually holds up.</w:t>
       </w:r>
     </w:p>
     <w:p/>
@@ -6648,52 +5799,30 @@
       </w:r>
     </w:p>
     <w:p>
-      <w:pPr>
-        <w:pStyle w:val="ListBullet"/>
-      </w:pPr>
       <w:r>
         <w:rPr>
           <w:b/>
           <w:i w:val="0"/>
         </w:rPr>
         <w:t>Attack Description:</w:t>
-      </w:r>
-      <w:r>
-        <w:rPr>
-          <w:b w:val="0"/>
-          <w:i w:val="0"/>
-        </w:rPr>
-        <w:t xml:space="preserve"> The public checking page is the whole point of the certificate feature, which makes it the biggest target in the system. It can be attacked in two ways.</w:t>
       </w:r>
     </w:p>
     <w:p>
       <w:r>
         <w:rPr>
-          <w:b/>
-          <w:i w:val="0"/>
-        </w:rPr>
-        <w:t>First, changing the record directly.</w:t>
-      </w:r>
-      <w:r>
-        <w:rPr>
-          <w:b w:val="0"/>
-          <w:i w:val="0"/>
-        </w:rPr>
-        <w:t xml:space="preserve"> Certificates are just rows in a MySQL database. Someone who can reach the database — through a stolen phpMyAdmin login, leaked database passwords, an SQL injection hole somewhere else in the app, or </w:t>
-      </w:r>
-      <w:r>
-        <w:rPr>
-          <w:b/>
-          <w:i w:val="0"/>
-        </w:rPr>
-        <w:t>a dishonest insider such as a student helper with database access</w:t>
-      </w:r>
-      <w:r>
-        <w:rPr>
-          <w:b w:val="0"/>
-          <w:i w:val="0"/>
-        </w:rPr>
-        <w:t xml:space="preserve"> — can run one simple </w:t>
+          <w:b w:val="0"/>
+          <w:i w:val="0"/>
+        </w:rPr>
+        <w:t>The public checking page is the whole point of the certificate feature, which makes it the biggest target in the system. It can be attacked in two ways.</w:t>
+      </w:r>
+    </w:p>
+    <w:p>
+      <w:r>
+        <w:rPr>
+          <w:b w:val="0"/>
+          <w:i w:val="0"/>
+        </w:rPr>
+        <w:t xml:space="preserve">The first way is changing the record directly. Certificates are just rows in a MySQL database. Someone who can reach the database can run one simple </w:t>
       </w:r>
       <w:r>
         <w:rPr>
@@ -6710,23 +5839,16 @@
           <w:b w:val="0"/>
           <w:i w:val="0"/>
         </w:rPr>
-        <w:t xml:space="preserve"> command and change a mark from 45 to 95. No web request is involved at all, so checking form input cannot stop it.</w:t>
+        <w:t xml:space="preserve"> command and change a mark from 45 to 95. They might reach it through a stolen phpMyAdmin login, leaked database passwords, an SQL injection hole somewhere else in the app, or by being a dishonest insider such as a student helper with database access. No web request is involved at all, so checking form input cannot stop it.</w:t>
       </w:r>
     </w:p>
     <w:p>
       <w:r>
         <w:rPr>
-          <w:b/>
-          <w:i w:val="0"/>
-        </w:rPr>
-        <w:t>Second, making up a certificate ID.</w:t>
-      </w:r>
-      <w:r>
-        <w:rPr>
-          <w:b w:val="0"/>
-          <w:i w:val="0"/>
-        </w:rPr>
-        <w:t xml:space="preserve"> If IDs were counted in order (</w:t>
+          <w:b w:val="0"/>
+          <w:i w:val="0"/>
+        </w:rPr>
+        <w:t xml:space="preserve">The second way is making up a certificate ID. If IDs were counted in order, such as </w:t>
       </w:r>
       <w:r>
         <w:rPr>
@@ -6743,7 +5865,7 @@
           <w:b w:val="0"/>
           <w:i w:val="0"/>
         </w:rPr>
-        <w:t xml:space="preserve">, </w:t>
+        <w:t xml:space="preserve"> and then </w:t>
       </w:r>
       <w:r>
         <w:rPr>
@@ -6760,13 +5882,10 @@
           <w:b w:val="0"/>
           <w:i w:val="0"/>
         </w:rPr>
-        <w:t>), an attacker could try them one by one to view other people's certificates. They could also invent a real-looking ID, print it on a fake paper certificate, and hope the employer reads the number instead of scanning the QR code.</w:t>
+        <w:t>, an attacker could try them one by one to view other people's certificates. They could also invent a real looking ID, print it on a fake paper certificate, and hope the employer reads the number instead of scanning the QR code.</w:t>
       </w:r>
     </w:p>
     <w:p>
-      <w:pPr>
-        <w:pStyle w:val="ListBullet"/>
-      </w:pPr>
       <w:r>
         <w:rPr>
           <w:b/>
@@ -6774,12 +5893,14 @@
         </w:rPr>
         <w:t>Risk Impact:</w:t>
       </w:r>
-      <w:r>
-        <w:rPr>
-          <w:b w:val="0"/>
-          <w:i w:val="0"/>
-        </w:rPr>
-        <w:t xml:space="preserve"> The college would be publicly confirming a fake qualification through its own website. This destroys the trust the whole system depends on, and could help someone get a job using marks they never earned.</w:t>
+    </w:p>
+    <w:p>
+      <w:r>
+        <w:rPr>
+          <w:b w:val="0"/>
+          <w:i w:val="0"/>
+        </w:rPr>
+        <w:t>The college would be publicly confirming a fake qualification through its own website. This destroys the trust the whole system depends on, and could help someone get a job using marks they never earned.</w:t>
       </w:r>
     </w:p>
     <w:p>
@@ -6796,22 +5917,12 @@
       </w:r>
     </w:p>
     <w:p>
-      <w:pPr>
-        <w:pStyle w:val="ListBullet"/>
-      </w:pPr>
       <w:r>
         <w:rPr>
           <w:b/>
           <w:i w:val="0"/>
         </w:rPr>
         <w:t>Attack Description:</w:t>
-      </w:r>
-      <w:r>
-        <w:rPr>
-          <w:b w:val="0"/>
-          <w:i w:val="0"/>
-        </w:rPr>
-        <w:t xml:space="preserve"> Module 1 owns the login page, which protects every other module, and it is open to the whole internet.</w:t>
       </w:r>
     </w:p>
     <w:p>
@@ -6820,21 +5931,7 @@
           <w:b w:val="0"/>
           <w:i w:val="0"/>
         </w:rPr>
-        <w:t xml:space="preserve">In a </w:t>
-      </w:r>
-      <w:r>
-        <w:rPr>
-          <w:b/>
-          <w:i w:val="0"/>
-        </w:rPr>
-        <w:t>brute-force attack</w:t>
-      </w:r>
-      <w:r>
-        <w:rPr>
-          <w:b w:val="0"/>
-          <w:i w:val="0"/>
-        </w:rPr>
-        <w:t>, a program tries password after password on one account. College email addresses follow an obvious pattern, so the attacker already knows real usernames. With no limit on attempts, thousands of guesses can be tried, and a weak password will be found quite quickly.</w:t>
+        <w:t>Module 1 owns the login page, which protects every other module, and it is open to the whole internet.</w:t>
       </w:r>
     </w:p>
     <w:p>
@@ -6843,27 +5940,19 @@
           <w:b w:val="0"/>
           <w:i w:val="0"/>
         </w:rPr>
-        <w:t xml:space="preserve">In a </w:t>
-      </w:r>
-      <w:r>
-        <w:rPr>
-          <w:b/>
-          <w:i w:val="0"/>
-        </w:rPr>
-        <w:t>credential-stuffing attack</w:t>
-      </w:r>
-      <w:r>
-        <w:rPr>
-          <w:b w:val="0"/>
-          <w:i w:val="0"/>
-        </w:rPr>
-        <w:t xml:space="preserve"> — which works far better in real life — the attacker uses email and password pairs stolen from a completely different website that was hacked before. Many people reuse the same password everywhere. Because each pair is only tried once per account, simple attempt limits often never notice.</w:t>
+        <w:t>In a brute force attack, a program tries password after password on one account. College email addresses follow an obvious pattern, so the attacker already knows real usernames. With no limit on attempts, thousands of guesses can be tried, and a weak password will be found quite quickly.</w:t>
       </w:r>
     </w:p>
     <w:p>
-      <w:pPr>
-        <w:pStyle w:val="ListBullet"/>
-      </w:pPr>
+      <w:r>
+        <w:rPr>
+          <w:b w:val="0"/>
+          <w:i w:val="0"/>
+        </w:rPr>
+        <w:t>In a credential stuffing attack, which works far better in real life, the attacker uses email and password pairs stolen from a completely different website that was hacked before. Many people reuse the same password everywhere. Because each pair is only tried once per account, simple attempt limits often never notice.</w:t>
+      </w:r>
+    </w:p>
+    <w:p>
       <w:r>
         <w:rPr>
           <w:b/>
@@ -6871,54 +5960,14 @@
         </w:rPr>
         <w:t>Risk Impact:</w:t>
       </w:r>
-      <w:r>
-        <w:rPr>
-          <w:b w:val="0"/>
-          <w:i w:val="0"/>
-        </w:rPr>
-        <w:t xml:space="preserve"> How bad this is depends on whose account is taken. A stolen </w:t>
-      </w:r>
-      <w:r>
-        <w:rPr>
-          <w:b/>
-          <w:i w:val="0"/>
-        </w:rPr>
-        <w:t>student</w:t>
-      </w:r>
-      <w:r>
-        <w:rPr>
-          <w:b w:val="0"/>
-          <w:i w:val="0"/>
-        </w:rPr>
-        <w:t xml:space="preserve"> account lets someone hand in work and read grades. A stolen </w:t>
-      </w:r>
-      <w:r>
-        <w:rPr>
-          <w:b/>
-          <w:i w:val="0"/>
-        </w:rPr>
-        <w:t>lecturer</w:t>
-      </w:r>
-      <w:r>
-        <w:rPr>
-          <w:b w:val="0"/>
-          <w:i w:val="0"/>
-        </w:rPr>
-        <w:t xml:space="preserve"> account lets someone change marks — and because marks automatically trigger certificates, this can create fake certificates. A stolen </w:t>
-      </w:r>
-      <w:r>
-        <w:rPr>
-          <w:b/>
-          <w:i w:val="0"/>
-        </w:rPr>
-        <w:t>admin</w:t>
-      </w:r>
-      <w:r>
-        <w:rPr>
-          <w:b w:val="0"/>
-          <w:i w:val="0"/>
-        </w:rPr>
-        <w:t xml:space="preserve"> account lets someone change permissions and issue or cancel certificates, which means the whole system's trust is gone.</w:t>
+    </w:p>
+    <w:p>
+      <w:r>
+        <w:rPr>
+          <w:b w:val="0"/>
+          <w:i w:val="0"/>
+        </w:rPr>
+        <w:t>How bad this is depends on whose account is taken. A stolen student account lets someone hand in work and read grades. A stolen lecturer account lets someone change marks, and because marks automatically trigger certificates, this can create fake certificates. A stolen admin account lets someone change permissions and issue or cancel certificates, which means the whole system's trust is gone.</w:t>
       </w:r>
     </w:p>
     <w:p>
@@ -6947,7 +5996,7 @@
           <w:b w:val="0"/>
           <w:i w:val="0"/>
         </w:rPr>
-        <w:t xml:space="preserve">Input validation is used everywhere in this module (Laravel's </w:t>
+        <w:t xml:space="preserve">Input validation is used everywhere in this module, through Laravel's </w:t>
       </w:r>
       <w:r>
         <w:rPr>
@@ -6998,21 +6047,7 @@
           <w:b w:val="0"/>
           <w:i w:val="0"/>
         </w:rPr>
-        <w:t xml:space="preserve"> rules on uploads). As the assignment requires, it is </w:t>
-      </w:r>
-      <w:r>
-        <w:rPr>
-          <w:b/>
-          <w:i w:val="0"/>
-        </w:rPr>
-        <w:t>not</w:t>
-      </w:r>
-      <w:r>
-        <w:rPr>
-          <w:b w:val="0"/>
-          <w:i w:val="0"/>
-        </w:rPr>
-        <w:t xml:space="preserve"> counted as one of the two practices below.</w:t>
+        <w:t xml:space="preserve"> rules on uploads. As the assignment requires, it is not counted as one of the two practices below.</w:t>
       </w:r>
     </w:p>
     <w:p>
@@ -7041,21 +6076,7 @@
           <w:b w:val="0"/>
           <w:i w:val="0"/>
         </w:rPr>
-        <w:t xml:space="preserve"> Instead of trusting the saved record, every certificate carries a security code that is worked out again </w:t>
-      </w:r>
-      <w:r>
-        <w:rPr>
-          <w:b/>
-          <w:i w:val="0"/>
-        </w:rPr>
-        <w:t>every single time someone checks it</w:t>
-      </w:r>
-      <w:r>
-        <w:rPr>
-          <w:b w:val="0"/>
-          <w:i w:val="0"/>
-        </w:rPr>
-        <w:t>:</w:t>
+        <w:t xml:space="preserve"> Instead of trusting the saved record, every certificate carries a security code that is worked out again every single time someone checks it.</w:t>
       </w:r>
     </w:p>
     <w:p>
@@ -7105,21 +6126,7 @@
           <w:b w:val="0"/>
           <w:i/>
         </w:rPr>
-        <w:t xml:space="preserve">How this stops the attack: if someone changes the mark in the database, the ingredients that make the code have changed too. The newly worked-out code no longer matches the saved one, so the page shows </w:t>
-      </w:r>
-      <w:r>
-        <w:rPr>
-          <w:b w:val="0"/>
-          <w:i/>
-        </w:rPr>
-        <w:t>TAMPERED</w:t>
-      </w:r>
-      <w:r>
-        <w:rPr>
-          <w:b w:val="0"/>
-          <w:i/>
-        </w:rPr>
-        <w:t xml:space="preserve"> instead of VALID. To fake it successfully, the attacker would need to find different data that produces the exact same SHA-256 code, which is not possible with today's computers.</w:t>
+        <w:t>How this stops the attack: if someone changes the mark in the database, the ingredients that make the code have changed too. The newly worked out code no longer matches the saved one, so the page shows TAMPERED instead of VALID. To fake it successfully, the attacker would need to find different data that produces the exact same SHA-256 code, which is not possible with today's computers.</w:t>
       </w:r>
     </w:p>
     <w:p>
@@ -7137,7 +6144,7 @@
           <w:b w:val="0"/>
           <w:i w:val="0"/>
         </w:rPr>
-        <w:t>Fake IDs are stopped in a different way — by making IDs random instead of counted:</w:t>
+        <w:t>Fake IDs are stopped in a different way, by making IDs random instead of counted.</w:t>
       </w:r>
     </w:p>
     <w:p>
@@ -7233,7 +6240,7 @@
           <w:b w:val="0"/>
           <w:i w:val="0"/>
         </w:rPr>
-        <w:t xml:space="preserve"> There are four layers here, and none of them depends on the user choosing a good password:</w:t>
+        <w:t xml:space="preserve"> There are four layers here, and none of them depends on the user choosing a good password.</w:t>
       </w:r>
     </w:p>
     <w:p>
@@ -7300,110 +6307,37 @@
     <w:p>
       <w:r>
         <w:rPr>
-          <w:b/>
-          <w:i w:val="0"/>
-        </w:rPr>
-        <w:t>*(a) Locking the account.</w:t>
-      </w:r>
-      <w:r>
-        <w:rPr>
-          <w:b w:val="0"/>
-          <w:i w:val="0"/>
-        </w:rPr>
-        <w:t xml:space="preserve"> After five wrong passwords in a row the account locks, and </w:t>
-      </w:r>
-      <w:r>
-        <w:rPr>
-          <w:b/>
-          <w:i w:val="0"/>
-        </w:rPr>
-        <w:t>only an admin can unlock it</w:t>
-      </w:r>
-      <w:r>
-        <w:rPr>
-          <w:b w:val="0"/>
-          <w:i w:val="0"/>
-        </w:rPr>
-        <w:t>. There is no "try again in 15 minutes". This is deliberate. A timed unlock only slows an automatic attack down, but a real lock stops it completely and makes a human look at what happened.*</w:t>
+          <w:b w:val="0"/>
+          <w:i/>
+        </w:rPr>
+        <w:t>(a) Locking the account. After five wrong passwords in a row the account locks, and only an admin can unlock it. There is no option to try again in fifteen minutes. This is deliberate. A timed unlock only slows an automatic attack down, but a real lock stops it completely and makes a human look at what happened.</w:t>
       </w:r>
     </w:p>
     <w:p>
       <w:r>
         <w:rPr>
-          <w:b/>
-          <w:i w:val="0"/>
-        </w:rPr>
-        <w:t>*(b) Blocking old passwords.</w:t>
-      </w:r>
-      <w:r>
-        <w:rPr>
-          <w:b w:val="0"/>
-          <w:i w:val="0"/>
-        </w:rPr>
-        <w:t xml:space="preserve"> A new password is compared against the last three saved passwords and refused if it matches. This stops a user going back to an old password that might already be in a leaked password list — which is exactly what a credential-stuffing attack uses.*</w:t>
+          <w:b w:val="0"/>
+          <w:i/>
+        </w:rPr>
+        <w:t>(b) Blocking old passwords. A new password is compared against the last three saved passwords and refused if it matches. This stops a user going back to an old password that might already be in a leaked password list, which is exactly what a credential stuffing attack uses.</w:t>
       </w:r>
     </w:p>
     <w:p>
       <w:r>
         <w:rPr>
-          <w:b/>
-          <w:i w:val="0"/>
-        </w:rPr>
-        <w:t>*(c) Bcrypt password storage.</w:t>
-      </w:r>
-      <w:r>
-        <w:rPr>
-          <w:b w:val="0"/>
-          <w:i w:val="0"/>
-        </w:rPr>
-        <w:t xml:space="preserve"> Passwords are saved using bcrypt, never as plain text. Bcrypt is slow on purpose and adds a different random salt to every password. So even if someone steals the whole database, cracking the passwords is very slow, and pre-made lookup tables are useless.*</w:t>
+          <w:b w:val="0"/>
+          <w:i/>
+        </w:rPr>
+        <w:t>(c) Bcrypt password storage. Passwords are saved using bcrypt, never as plain text. Bcrypt is slow on purpose and adds a different random salt to every password. So even if someone steals the whole database, cracking the passwords is very slow, and pre made lookup tables are useless.</w:t>
       </w:r>
     </w:p>
     <w:p>
       <w:r>
         <w:rPr>
-          <w:b/>
-          <w:i w:val="0"/>
-        </w:rPr>
-        <w:t>*(d) Logging every login attempt.</w:t>
-      </w:r>
-      <w:r>
-        <w:rPr>
-          <w:b w:val="0"/>
-          <w:i w:val="0"/>
-        </w:rPr>
-        <w:t xml:space="preserve"> Every login, logout and failed attempt is saved with the IP address and browser. This is the layer that lets you </w:t>
-      </w:r>
-      <w:r>
-        <w:rPr>
-          <w:b/>
-          <w:i w:val="0"/>
-        </w:rPr>
-        <w:t>notice</w:t>
-      </w:r>
-      <w:r>
-        <w:rPr>
-          <w:b w:val="0"/>
-          <w:i w:val="0"/>
-        </w:rPr>
-        <w:t xml:space="preserve"> an attack. A credential-stuffing attack looks like lots of </w:t>
-      </w:r>
-      <w:r>
-        <w:rPr>
-          <w:rFonts w:ascii="Consolas" w:hAnsi="Consolas"/>
-          <w:b w:val="0"/>
-          <w:i w:val="0"/>
-          <w:color w:val="C0333C"/>
-          <w:sz w:val="19"/>
-        </w:rPr>
-        <w:t>auth.failed</w:t>
-      </w:r>
-      <w:r>
-        <w:rPr>
-          <w:b w:val="0"/>
-          <w:i w:val="0"/>
-        </w:rPr>
-        <w:t xml:space="preserve"> rows from just a few IP addresses across many different accounts. Without logging, that pattern is completely invisible. An admin can filter and export these records to look at them.*</w:t>
+          <w:b w:val="0"/>
+          <w:i/>
+        </w:rPr>
+        <w:t>(d) Logging every login attempt. Every login, logout and failed attempt is saved with the IP address and browser. This is the layer that lets you notice an attack. A credential stuffing attack looks like lots of `auth.failed` rows from just a few IP addresses across many different accounts. Without logging, that pattern is completely invisible. An admin can filter and export these records to look at them.</w:t>
       </w:r>
     </w:p>
     <w:p>
@@ -7458,21 +6392,7 @@
           <w:b w:val="0"/>
           <w:i w:val="0"/>
         </w:rPr>
-        <w:t xml:space="preserve"> The web service described below </w:t>
-      </w:r>
-      <w:r>
-        <w:rPr>
-          <w:b/>
-          <w:i w:val="0"/>
-        </w:rPr>
-        <w:t>is not in the code yet</w:t>
-      </w:r>
-      <w:r>
-        <w:rPr>
-          <w:b w:val="0"/>
-          <w:i w:val="0"/>
-        </w:rPr>
-        <w:t xml:space="preserve">. Right now there is no </w:t>
+        <w:t xml:space="preserve"> The web service described below is not in the code yet. Right now there is no </w:t>
       </w:r>
       <w:r>
         <w:rPr>
@@ -7489,21 +6409,7 @@
           <w:b w:val="0"/>
           <w:i w:val="0"/>
         </w:rPr>
-        <w:t xml:space="preserve"> file, no REST or SOAP endpoint, and the system never calls another service. Everything below is a </w:t>
-      </w:r>
-      <w:r>
-        <w:rPr>
-          <w:b/>
-          <w:i w:val="0"/>
-        </w:rPr>
-        <w:t>plan to build from</w:t>
-      </w:r>
-      <w:r>
-        <w:rPr>
-          <w:b w:val="0"/>
-          <w:i w:val="0"/>
-        </w:rPr>
-        <w:t xml:space="preserve">. Before you submit, you must create </w:t>
+        <w:t xml:space="preserve"> file, no REST or SOAP endpoint, and the system never calls another service. Everything below is a plan to build from. Before you submit, you must create </w:t>
       </w:r>
       <w:r>
         <w:rPr>
@@ -7552,33 +6458,19 @@
     <w:p>
       <w:r>
         <w:rPr>
-          <w:b/>
-          <w:i w:val="0"/>
-        </w:rPr>
-        <w:t>As a provider</w:t>
-      </w:r>
-      <w:r>
-        <w:rPr>
-          <w:b w:val="0"/>
-          <w:i w:val="0"/>
-        </w:rPr>
-        <w:t>, it offers the certificate checking service. This was the obvious choice, because checking a certificate is already a public, read-only lookup that returns a fixed set of fields, and it is the one thing other modules and outside people actually need from Module 1.</w:t>
+          <w:b w:val="0"/>
+          <w:i w:val="0"/>
+        </w:rPr>
+        <w:t>As a provider, it offers the certificate checking service. This was the obvious choice, because checking a certificate is already a public, read only lookup that returns a fixed set of fields. It is also the one thing other modules and outside people actually need from Module 1.</w:t>
       </w:r>
     </w:p>
     <w:p>
       <w:r>
         <w:rPr>
-          <w:b/>
-          <w:i w:val="0"/>
-        </w:rPr>
-        <w:t>As a consumer</w:t>
-      </w:r>
-      <w:r>
-        <w:rPr>
-          <w:b w:val="0"/>
-          <w:i w:val="0"/>
-        </w:rPr>
-        <w:t>, it calls Module 2's course information service. When a certificate is printed, the course code and title come from Module 2, because Module 2 owns all course data. Module 1 never reads Module 2's tables directly.</w:t>
+          <w:b w:val="0"/>
+          <w:i w:val="0"/>
+        </w:rPr>
+        <w:t>As a consumer, it calls Module 2's course information service. When a certificate is printed, the course code and title come from Module 2, because Module 2 owns all course data. Module 1 never reads Module 2's tables directly.</w:t>
       </w:r>
     </w:p>
     <w:p>
@@ -7613,7 +6505,7 @@
           <w:i w:val="0"/>
           <w:color w:val="1F3864"/>
         </w:rPr>
-        <w:t>Interface Agreement (IFA) — Service Exposure Specification</w:t>
+        <w:t>Interface Agreement (IFA) for Service Exposure</w:t>
       </w:r>
     </w:p>
     <w:tbl>
@@ -7752,7 +6644,7 @@
                 <w:b w:val="0"/>
                 <w:i w:val="0"/>
               </w:rPr>
-              <w:t>Module 1: Identity, Access &amp; Digital Credentialing Module</w:t>
+              <w:t>Module 1: Identity, Access and Digital Credentialing Module</w:t>
             </w:r>
           </w:p>
         </w:tc>
@@ -8201,7 +7093,7 @@
                 <w:b w:val="0"/>
                 <w:i w:val="0"/>
               </w:rPr>
-              <w:t>: status + holder</w:t>
+              <w:t>: status and holder</w:t>
             </w:r>
           </w:p>
           <w:p>
@@ -8300,7 +7192,7 @@
                 <w:b w:val="0"/>
                 <w:i w:val="0"/>
               </w:rPr>
-              <w:t xml:space="preserve">Letters and numbers (e.g. </w:t>
+              <w:t xml:space="preserve">Letters and numbers, e.g. </w:t>
             </w:r>
             <w:r>
               <w:rPr>
@@ -8311,13 +7203,6 @@
                 <w:sz w:val="19"/>
               </w:rPr>
               <w:t>REQ-CRED-84920</w:t>
-            </w:r>
-            <w:r>
-              <w:rPr>
-                <w:b w:val="0"/>
-                <w:i w:val="0"/>
-              </w:rPr>
-              <w:t>)</w:t>
             </w:r>
           </w:p>
         </w:tc>
@@ -8601,7 +7486,7 @@
                 <w:b w:val="0"/>
                 <w:i w:val="0"/>
               </w:rPr>
-              <w:t xml:space="preserve"> (Success), </w:t>
+              <w:t xml:space="preserve"> for Success, </w:t>
             </w:r>
             <w:r>
               <w:rPr>
@@ -8618,7 +7503,7 @@
                 <w:b w:val="0"/>
                 <w:i w:val="0"/>
               </w:rPr>
-              <w:t xml:space="preserve"> (Fail), </w:t>
+              <w:t xml:space="preserve"> for Fail, </w:t>
             </w:r>
             <w:r>
               <w:rPr>
@@ -8635,7 +7520,7 @@
                 <w:b w:val="0"/>
                 <w:i w:val="0"/>
               </w:rPr>
-              <w:t xml:space="preserve"> (Error)</w:t>
+              <w:t xml:space="preserve"> for Error</w:t>
             </w:r>
           </w:p>
         </w:tc>
@@ -9029,7 +7914,7 @@
                 <w:b w:val="0"/>
                 <w:i w:val="0"/>
               </w:rPr>
-              <w:t xml:space="preserve">Letters only; not sent when </w:t>
+              <w:t xml:space="preserve">Letters only. Not sent when </w:t>
             </w:r>
             <w:r>
               <w:rPr>
@@ -9046,7 +7931,7 @@
                 <w:b w:val="0"/>
                 <w:i w:val="0"/>
               </w:rPr>
-              <w:t xml:space="preserve"> = 1</w:t>
+              <w:t xml:space="preserve"> is 1</w:t>
             </w:r>
           </w:p>
         </w:tc>
@@ -9206,7 +8091,7 @@
                 <w:b w:val="0"/>
                 <w:i w:val="0"/>
               </w:rPr>
-              <w:t>0.00 – 100.00</w:t>
+              <w:t>0.00 to 100.00</w:t>
             </w:r>
           </w:p>
         </w:tc>
@@ -9371,7 +8256,7 @@
                 <w:b w:val="0"/>
                 <w:i w:val="0"/>
               </w:rPr>
-              <w:t xml:space="preserve"> = 3.</w:t>
+              <w:t xml:space="preserve"> is 3.</w:t>
             </w:r>
           </w:p>
         </w:tc>
@@ -9451,7 +8336,7 @@
         <w:br/>
         <w:t>{</w:t>
         <w:br/>
-        <w:t xml:space="preserve">    // The Facade again: adding a web service needed no knowledge of</w:t>
+        <w:t xml:space="preserve">    // The Facade again. Adding a web service needed no knowledge of</w:t>
         <w:br/>
         <w:t xml:space="preserve">    // hashing, PDFs or badge rules.</w:t>
         <w:br/>
@@ -9597,7 +8482,7 @@
         <w:t>use Illuminate\Support\Facades\Route;</w:t>
         <w:br/>
         <w:br/>
-        <w:t>// Public on purpose: checking a certificate must work with no account.</w:t>
+        <w:t>// Public on purpose, because checking a certificate must work with no account.</w:t>
         <w:br/>
         <w:t>Route::get('/credentials/verify', [CredentialApiController::class, 'verify']);</w:t>
       </w:r>
@@ -9662,7 +8547,7 @@
           <w:b w:val="0"/>
           <w:i/>
         </w:rPr>
-        <w:t>Figure 6.2: The Answer for a Cancelled Certificate, Showing `"credentialStatus": "REVOKED"`</w:t>
+        <w:t>Figure 6.2: The Answer for a Cancelled Certificate, Showing REVOKED as the Credential Status</w:t>
       </w:r>
     </w:p>
     <w:p>
@@ -9684,14 +8569,17 @@
           <w:b w:val="0"/>
           <w:i w:val="0"/>
         </w:rPr>
-        <w:t xml:space="preserve">So that a certificate always shows the correct course name, Module 1 calls </w:t>
-      </w:r>
-      <w:r>
-        <w:rPr>
-          <w:b/>
-          <w:i w:val="0"/>
-        </w:rPr>
-        <w:t>Module 2's web service (`GET /api/courses/info`)</w:t>
+        <w:t xml:space="preserve">So that a certificate always shows the correct course name, Module 1 calls Module 2's web service at </w:t>
+      </w:r>
+      <w:r>
+        <w:rPr>
+          <w:rFonts w:ascii="Consolas" w:hAnsi="Consolas"/>
+          <w:b w:val="0"/>
+          <w:i w:val="0"/>
+          <w:color w:val="C0333C"/>
+          <w:sz w:val="19"/>
+        </w:rPr>
+        <w:t>GET /api/courses/info</w:t>
       </w:r>
       <w:r>
         <w:rPr>
@@ -9711,7 +8599,7 @@
           <w:i w:val="0"/>
           <w:color w:val="1F3864"/>
         </w:rPr>
-        <w:t>Interface Agreement (IFA) — Service Consumption Specification</w:t>
+        <w:t>Interface Agreement (IFA) for Service Consumption</w:t>
       </w:r>
     </w:p>
     <w:tbl>
@@ -9882,7 +8770,7 @@
                 <w:b w:val="0"/>
                 <w:i w:val="0"/>
               </w:rPr>
-              <w:t>Module 1: Identity, Access &amp; Digital Credentialing Module</w:t>
+              <w:t>Module 1: Identity, Access and Digital Credentialing Module</w:t>
             </w:r>
           </w:p>
         </w:tc>
@@ -10004,7 +8892,7 @@
           <w:i w:val="0"/>
           <w:color w:val="1F3864"/>
         </w:rPr>
-        <w:t>Request Parameters (IFA Requirement — Consumption)</w:t>
+        <w:t>Request Parameters (IFA Requirement for Consumption)</w:t>
       </w:r>
     </w:p>
     <w:tbl>
@@ -10268,7 +9156,7 @@
                 <w:b w:val="0"/>
                 <w:i w:val="0"/>
               </w:rPr>
-              <w:t>: code + title</w:t>
+              <w:t>: code and title</w:t>
             </w:r>
           </w:p>
           <w:p>
@@ -10367,7 +9255,7 @@
                 <w:b w:val="0"/>
                 <w:i w:val="0"/>
               </w:rPr>
-              <w:t xml:space="preserve">Letters and numbers (e.g. </w:t>
+              <w:t xml:space="preserve">Letters and numbers, e.g. </w:t>
             </w:r>
             <w:r>
               <w:rPr>
@@ -10378,13 +9266,6 @@
                 <w:sz w:val="19"/>
               </w:rPr>
               <w:t>CRS-REQ-64e9a</w:t>
-            </w:r>
-            <w:r>
-              <w:rPr>
-                <w:b w:val="0"/>
-                <w:i w:val="0"/>
-              </w:rPr>
-              <w:t>)</w:t>
             </w:r>
           </w:p>
         </w:tc>
@@ -10484,7 +9365,7 @@
           <w:i w:val="0"/>
           <w:color w:val="1F3864"/>
         </w:rPr>
-        <w:t>Response Parameters (IFA Requirement — Consumption)</w:t>
+        <w:t>Response Parameters (IFA Requirement for Consumption)</w:t>
       </w:r>
     </w:p>
     <w:tbl>
@@ -10668,7 +9549,7 @@
                 <w:b w:val="0"/>
                 <w:i w:val="0"/>
               </w:rPr>
-              <w:t xml:space="preserve"> (Success), </w:t>
+              <w:t xml:space="preserve"> for Success, </w:t>
             </w:r>
             <w:r>
               <w:rPr>
@@ -10685,7 +9566,7 @@
                 <w:b w:val="0"/>
                 <w:i w:val="0"/>
               </w:rPr>
-              <w:t xml:space="preserve"> (Fail), </w:t>
+              <w:t xml:space="preserve"> for Fail, </w:t>
             </w:r>
             <w:r>
               <w:rPr>
@@ -10702,7 +9583,7 @@
                 <w:b w:val="0"/>
                 <w:i w:val="0"/>
               </w:rPr>
-              <w:t xml:space="preserve"> (Error)</w:t>
+              <w:t xml:space="preserve"> for Error</w:t>
             </w:r>
           </w:p>
         </w:tc>
@@ -10865,7 +9746,7 @@
                 <w:b w:val="0"/>
                 <w:i w:val="0"/>
               </w:rPr>
-              <w:t xml:space="preserve">Letters and numbers (e.g. </w:t>
+              <w:t xml:space="preserve">Letters and numbers, e.g. </w:t>
             </w:r>
             <w:r>
               <w:rPr>
@@ -10876,13 +9757,6 @@
                 <w:sz w:val="19"/>
               </w:rPr>
               <w:t>BMIT3173</w:t>
-            </w:r>
-            <w:r>
-              <w:rPr>
-                <w:b w:val="0"/>
-                <w:i w:val="0"/>
-              </w:rPr>
-              <w:t>)</w:t>
             </w:r>
           </w:p>
         </w:tc>
@@ -11059,7 +9933,7 @@
                 <w:b w:val="0"/>
                 <w:i w:val="0"/>
               </w:rPr>
-              <w:t xml:space="preserve"> = 2</w:t>
+              <w:t xml:space="preserve"> is 2</w:t>
             </w:r>
           </w:p>
         </w:tc>
@@ -11299,7 +10173,7 @@
           <w:b w:val="0"/>
           <w:i/>
         </w:rPr>
-        <w:t>OWASP Top 10:2021 — The ten most critical web application security risks</w:t>
+        <w:t>OWASP Top 10:2021 The ten most critical web application security risks</w:t>
       </w:r>
       <w:r>
         <w:rPr>
@@ -11619,7 +10493,7 @@
           <w:b w:val="0"/>
           <w:i/>
         </w:rPr>
-        <w:t>Figure 8.1: Terminal Output of `php artisan test` Showing 62 Passing Tests</w:t>
+        <w:t>Figure 8.1: Terminal Output of php artisan test Showing 62 Passing Tests</w:t>
       </w:r>
     </w:p>
     <w:p>
@@ -11730,7 +10604,7 @@
           <w:b w:val="0"/>
           <w:i w:val="0"/>
         </w:rPr>
-        <w:t>Sign and date the AI Usage Disclosure Form — and rewrite §4.3, §5.1, §5.2 in your own words</w:t>
+        <w:t>Sign and date the AI Usage Disclosure Form, and rewrite sections 4.3, 5.1 and 5.2 in your own words</w:t>
       </w:r>
     </w:p>
     <w:p>
@@ -11748,35 +10622,7 @@
           <w:b w:val="0"/>
           <w:i w:val="0"/>
         </w:rPr>
-        <w:t xml:space="preserve">Draw </w:t>
-      </w:r>
-      <w:r>
-        <w:rPr>
-          <w:b/>
-          <w:i w:val="0"/>
-        </w:rPr>
-        <w:t>Figure 3.1</w:t>
-      </w:r>
-      <w:r>
-        <w:rPr>
-          <w:b w:val="0"/>
-          <w:i w:val="0"/>
-        </w:rPr>
-        <w:t xml:space="preserve"> (entity class diagram — object references, </w:t>
-      </w:r>
-      <w:r>
-        <w:rPr>
-          <w:b w:val="0"/>
-          <w:i/>
-        </w:rPr>
-        <w:t>not</w:t>
-      </w:r>
-      <w:r>
-        <w:rPr>
-          <w:b w:val="0"/>
-          <w:i w:val="0"/>
-        </w:rPr>
-        <w:t xml:space="preserve"> an ERD) and paste the Drive link</w:t>
+        <w:t>Draw Figure 3.1, the entity class diagram, using object references and not an ERD, then paste the Drive link</w:t>
       </w:r>
     </w:p>
     <w:p>
@@ -11794,21 +10640,7 @@
           <w:b w:val="0"/>
           <w:i w:val="0"/>
         </w:rPr>
-        <w:t xml:space="preserve">Draw </w:t>
-      </w:r>
-      <w:r>
-        <w:rPr>
-          <w:b/>
-          <w:i w:val="0"/>
-        </w:rPr>
-        <w:t>Figure 4.1</w:t>
-      </w:r>
-      <w:r>
-        <w:rPr>
-          <w:b w:val="0"/>
-          <w:i w:val="0"/>
-        </w:rPr>
-        <w:t xml:space="preserve"> (Facade class diagram) and paste the Drive link</w:t>
+        <w:t>Draw Figure 4.1, the Facade class diagram, then paste the Drive link</w:t>
       </w:r>
     </w:p>
     <w:p>
@@ -11826,7 +10658,7 @@
           <w:b w:val="0"/>
           <w:i w:val="0"/>
         </w:rPr>
-        <w:t>Take screenshots for Figures 2.1–2.11, 5.1–5.4, 6.1–6.3 and 8.1</w:t>
+        <w:t>Take screenshots for Figures 2.1 to 2.11, 5.1 to 5.4, 6.1 to 6.3, and 8.1</w:t>
       </w:r>
     </w:p>
     <w:p>
@@ -11841,17 +10673,10 @@
       </w:r>
       <w:r>
         <w:rPr>
-          <w:b/>
-          <w:i w:val="0"/>
-        </w:rPr>
-        <w:t>Build the web service in Section 6</w:t>
-      </w:r>
-      <w:r>
-        <w:rPr>
-          <w:b w:val="0"/>
-          <w:i w:val="0"/>
-        </w:rPr>
-        <w:t xml:space="preserve"> — it does not exist yet</w:t>
+          <w:b w:val="0"/>
+          <w:i w:val="0"/>
+        </w:rPr>
+        <w:t>Build the web service in Section 6, because it does not exist yet</w:t>
       </w:r>
     </w:p>
     <w:p>
@@ -11869,7 +10694,7 @@
           <w:b w:val="0"/>
           <w:i w:val="0"/>
         </w:rPr>
-        <w:t>Replace Figures 6.1–6.3 with real Postman screenshots once built</w:t>
+        <w:t>Replace Figures 6.1 to 6.3 with real Postman screenshots once built</w:t>
       </w:r>
     </w:p>
     <w:p>
@@ -11887,7 +10712,7 @@
           <w:b w:val="0"/>
           <w:i w:val="0"/>
         </w:rPr>
-        <w:t>Rebuild the Table of Contents in Word (References &gt; Table of Contents &gt; Automatic Table)</w:t>
+        <w:t>Rebuild the Table of Contents in Word using References then Table of Contents then Automatic Table</w:t>
       </w:r>
     </w:p>
     <w:p>

</xml_diff>